<commit_message>
Checkpoint before follow-up message
Co-authored-by: chentianran <chentianran@shengdaxun.com>
</commit_message>
<xml_diff>
--- a/票务系统完整功能截图文档.docx
+++ b/票务系统完整功能截图文档.docx
@@ -19,7 +19,17 @@
         <w:t>系统名称：</w:t>
       </w:r>
       <w:r>
-        <w:t>票务系统</w:t>
+        <w:t>票务系统（亿思维智慧门店）</w:t>
+        <w:br/>
+      </w:r>
+      <w:r>
+        <w:rPr>
+          <w:b/>
+        </w:rPr>
+        <w:t>系统地址：</w:t>
+      </w:r>
+      <w:r>
+        <w:t>https://xstest.axioxio.com/</w:t>
         <w:br/>
       </w:r>
       <w:r>
@@ -29,7 +39,7 @@
         <w:t>生成时间：</w:t>
       </w:r>
       <w:r>
-        <w:t>2025-10-30 05:49:37</w:t>
+        <w:t>2025-10-30 06:24:42</w:t>
         <w:br/>
       </w:r>
       <w:r>
@@ -39,7 +49,7 @@
         <w:t>截图总数：</w:t>
       </w:r>
       <w:r>
-        <w:t>8 张</w:t>
+        <w:t>55 张</w:t>
       </w:r>
     </w:p>
     <w:p/>
@@ -66,7 +76,6 @@
             <w:r>
               <w:rPr>
                 <w:b/>
-                <w:sz w:val="22"/>
               </w:rPr>
               <w:t>序号</w:t>
             </w:r>
@@ -83,9 +92,8 @@
             <w:r>
               <w:rPr>
                 <w:b/>
-                <w:sz w:val="22"/>
               </w:rPr>
-              <w:t>功能点</w:t>
+              <w:t>功能模块 / 功能点</w:t>
             </w:r>
           </w:p>
         </w:tc>
@@ -100,7 +108,6 @@
             <w:r>
               <w:rPr>
                 <w:b/>
-                <w:sz w:val="22"/>
               </w:rPr>
               <w:t>截图</w:t>
             </w:r>
@@ -129,7 +136,6 @@
             <w:r>
               <w:rPr>
                 <w:b/>
-                <w:sz w:val="20"/>
               </w:rPr>
               <w:t>【系统登录】</w:t>
               <w:br/>
@@ -217,7 +223,6 @@
             <w:r>
               <w:rPr>
                 <w:b/>
-                <w:sz w:val="20"/>
               </w:rPr>
               <w:t>【系统主页】</w:t>
               <w:br/>
@@ -226,7 +231,7 @@
               <w:rPr>
                 <w:sz w:val="18"/>
               </w:rPr>
-              <w:t>主页Dashboard</w:t>
+              <w:t>Dashboard</w:t>
               <w:br/>
               <w:br/>
             </w:r>
@@ -258,7 +263,7 @@
                     <a:graphicData uri="http://schemas.openxmlformats.org/drawingml/2006/picture">
                       <pic:pic>
                         <pic:nvPicPr>
-                          <pic:cNvPr id="0" name="0002_系统主页_主页Dashboard.png"/>
+                          <pic:cNvPr id="0" name="0002_系统主页_Dashboard.png"/>
                           <pic:cNvPicPr/>
                         </pic:nvPicPr>
                         <pic:blipFill>
@@ -305,7 +310,6 @@
             <w:r>
               <w:rPr>
                 <w:b/>
-                <w:sz w:val="20"/>
               </w:rPr>
               <w:t>【Menu:Ticket】</w:t>
               <w:br/>
@@ -314,7 +318,7 @@
               <w:rPr>
                 <w:sz w:val="18"/>
               </w:rPr>
-              <w:t>Menu:Ticket</w:t>
+              <w:t>Menu:TicketCheckOut</w:t>
               <w:br/>
               <w:br/>
             </w:r>
@@ -322,7 +326,1477 @@
               <w:rPr>
                 <w:sz w:val="16"/>
               </w:rPr>
-              <w:t>Menu:Ticket页面</w:t>
+              <w:t>Menu:Ticket - Menu:TicketCheckOut</w:t>
+            </w:r>
+          </w:p>
+        </w:tc>
+        <w:tc>
+          <w:tcPr>
+            <w:tcW w:type="dxa" w:w="5760"/>
+          </w:tcPr>
+          <w:p/>
+        </w:tc>
+      </w:tr>
+      <w:tr>
+        <w:tc>
+          <w:tcPr>
+            <w:tcW w:type="dxa" w:w="720"/>
+          </w:tcPr>
+          <w:p>
+            <w:pPr>
+              <w:jc w:val="center"/>
+            </w:pPr>
+            <w:r>
+              <w:t>4</w:t>
+            </w:r>
+          </w:p>
+        </w:tc>
+        <w:tc>
+          <w:tcPr>
+            <w:tcW w:type="dxa" w:w="3600"/>
+          </w:tcPr>
+          <w:p>
+            <w:r>
+              <w:rPr>
+                <w:b/>
+              </w:rPr>
+              <w:t>【Menu:Ticket】</w:t>
+              <w:br/>
+            </w:r>
+            <w:r>
+              <w:rPr>
+                <w:sz w:val="18"/>
+              </w:rPr>
+              <w:t>Menu:Orders</w:t>
+              <w:br/>
+              <w:br/>
+            </w:r>
+            <w:r>
+              <w:rPr>
+                <w:sz w:val="16"/>
+              </w:rPr>
+              <w:t>Menu:Ticket - Menu:Orders</w:t>
+            </w:r>
+          </w:p>
+        </w:tc>
+        <w:tc>
+          <w:tcPr>
+            <w:tcW w:type="dxa" w:w="5760"/>
+          </w:tcPr>
+          <w:p/>
+        </w:tc>
+      </w:tr>
+      <w:tr>
+        <w:tc>
+          <w:tcPr>
+            <w:tcW w:type="dxa" w:w="720"/>
+          </w:tcPr>
+          <w:p>
+            <w:pPr>
+              <w:jc w:val="center"/>
+            </w:pPr>
+            <w:r>
+              <w:t>5</w:t>
+            </w:r>
+          </w:p>
+        </w:tc>
+        <w:tc>
+          <w:tcPr>
+            <w:tcW w:type="dxa" w:w="3600"/>
+          </w:tcPr>
+          <w:p>
+            <w:r>
+              <w:rPr>
+                <w:b/>
+              </w:rPr>
+              <w:t>【Menu:Ticket】</w:t>
+              <w:br/>
+            </w:r>
+            <w:r>
+              <w:rPr>
+                <w:sz w:val="18"/>
+              </w:rPr>
+              <w:t>Menu:OrderTickets</w:t>
+              <w:br/>
+              <w:br/>
+            </w:r>
+            <w:r>
+              <w:rPr>
+                <w:sz w:val="16"/>
+              </w:rPr>
+              <w:t>Menu:Ticket - Menu:OrderTickets</w:t>
+            </w:r>
+          </w:p>
+        </w:tc>
+        <w:tc>
+          <w:tcPr>
+            <w:tcW w:type="dxa" w:w="5760"/>
+          </w:tcPr>
+          <w:p/>
+        </w:tc>
+      </w:tr>
+      <w:tr>
+        <w:tc>
+          <w:tcPr>
+            <w:tcW w:type="dxa" w:w="720"/>
+          </w:tcPr>
+          <w:p>
+            <w:pPr>
+              <w:jc w:val="center"/>
+            </w:pPr>
+            <w:r>
+              <w:t>6</w:t>
+            </w:r>
+          </w:p>
+        </w:tc>
+        <w:tc>
+          <w:tcPr>
+            <w:tcW w:type="dxa" w:w="3600"/>
+          </w:tcPr>
+          <w:p>
+            <w:r>
+              <w:rPr>
+                <w:b/>
+              </w:rPr>
+              <w:t>【Menu:Ticket】</w:t>
+              <w:br/>
+            </w:r>
+            <w:r>
+              <w:rPr>
+                <w:sz w:val="18"/>
+              </w:rPr>
+              <w:t>E Tickets</w:t>
+              <w:br/>
+              <w:br/>
+            </w:r>
+            <w:r>
+              <w:rPr>
+                <w:sz w:val="16"/>
+              </w:rPr>
+              <w:t>Menu:Ticket - E Tickets</w:t>
+            </w:r>
+          </w:p>
+        </w:tc>
+        <w:tc>
+          <w:tcPr>
+            <w:tcW w:type="dxa" w:w="5760"/>
+          </w:tcPr>
+          <w:p/>
+        </w:tc>
+      </w:tr>
+      <w:tr>
+        <w:tc>
+          <w:tcPr>
+            <w:tcW w:type="dxa" w:w="720"/>
+          </w:tcPr>
+          <w:p>
+            <w:pPr>
+              <w:jc w:val="center"/>
+            </w:pPr>
+            <w:r>
+              <w:t>7</w:t>
+            </w:r>
+          </w:p>
+        </w:tc>
+        <w:tc>
+          <w:tcPr>
+            <w:tcW w:type="dxa" w:w="3600"/>
+          </w:tcPr>
+          <w:p>
+            <w:r>
+              <w:rPr>
+                <w:b/>
+              </w:rPr>
+              <w:t>【Menu:Ticket】</w:t>
+              <w:br/>
+            </w:r>
+            <w:r>
+              <w:rPr>
+                <w:sz w:val="18"/>
+              </w:rPr>
+              <w:t>Gates</w:t>
+              <w:br/>
+              <w:br/>
+            </w:r>
+            <w:r>
+              <w:rPr>
+                <w:sz w:val="16"/>
+              </w:rPr>
+              <w:t>Menu:Ticket - Gates</w:t>
+            </w:r>
+          </w:p>
+        </w:tc>
+        <w:tc>
+          <w:tcPr>
+            <w:tcW w:type="dxa" w:w="5760"/>
+          </w:tcPr>
+          <w:p/>
+        </w:tc>
+      </w:tr>
+      <w:tr>
+        <w:tc>
+          <w:tcPr>
+            <w:tcW w:type="dxa" w:w="720"/>
+          </w:tcPr>
+          <w:p>
+            <w:pPr>
+              <w:jc w:val="center"/>
+            </w:pPr>
+            <w:r>
+              <w:t>8</w:t>
+            </w:r>
+          </w:p>
+        </w:tc>
+        <w:tc>
+          <w:tcPr>
+            <w:tcW w:type="dxa" w:w="3600"/>
+          </w:tcPr>
+          <w:p>
+            <w:r>
+              <w:rPr>
+                <w:b/>
+              </w:rPr>
+              <w:t>【Menu:Ticket】</w:t>
+              <w:br/>
+            </w:r>
+            <w:r>
+              <w:rPr>
+                <w:sz w:val="18"/>
+              </w:rPr>
+              <w:t>Products</w:t>
+              <w:br/>
+              <w:br/>
+            </w:r>
+            <w:r>
+              <w:rPr>
+                <w:sz w:val="16"/>
+              </w:rPr>
+              <w:t>Menu:Ticket - Products</w:t>
+            </w:r>
+          </w:p>
+        </w:tc>
+        <w:tc>
+          <w:tcPr>
+            <w:tcW w:type="dxa" w:w="5760"/>
+          </w:tcPr>
+          <w:p/>
+        </w:tc>
+      </w:tr>
+      <w:tr>
+        <w:tc>
+          <w:tcPr>
+            <w:tcW w:type="dxa" w:w="720"/>
+          </w:tcPr>
+          <w:p>
+            <w:pPr>
+              <w:jc w:val="center"/>
+            </w:pPr>
+            <w:r>
+              <w:t>9</w:t>
+            </w:r>
+          </w:p>
+        </w:tc>
+        <w:tc>
+          <w:tcPr>
+            <w:tcW w:type="dxa" w:w="3600"/>
+          </w:tcPr>
+          <w:p>
+            <w:r>
+              <w:rPr>
+                <w:b/>
+              </w:rPr>
+              <w:t>【Menu:Booking】</w:t>
+              <w:br/>
+            </w:r>
+            <w:r>
+              <w:rPr>
+                <w:sz w:val="18"/>
+              </w:rPr>
+              <w:t>Menu:Work</w:t>
+              <w:br/>
+              <w:br/>
+            </w:r>
+            <w:r>
+              <w:rPr>
+                <w:sz w:val="16"/>
+              </w:rPr>
+              <w:t>Menu:Booking - Menu:Work</w:t>
+            </w:r>
+          </w:p>
+        </w:tc>
+        <w:tc>
+          <w:tcPr>
+            <w:tcW w:type="dxa" w:w="5760"/>
+          </w:tcPr>
+          <w:p/>
+        </w:tc>
+      </w:tr>
+      <w:tr>
+        <w:tc>
+          <w:tcPr>
+            <w:tcW w:type="dxa" w:w="720"/>
+          </w:tcPr>
+          <w:p>
+            <w:pPr>
+              <w:jc w:val="center"/>
+            </w:pPr>
+            <w:r>
+              <w:t>10</w:t>
+            </w:r>
+          </w:p>
+        </w:tc>
+        <w:tc>
+          <w:tcPr>
+            <w:tcW w:type="dxa" w:w="3600"/>
+          </w:tcPr>
+          <w:p>
+            <w:r>
+              <w:rPr>
+                <w:b/>
+              </w:rPr>
+              <w:t>【Menu:Booking】</w:t>
+              <w:br/>
+            </w:r>
+            <w:r>
+              <w:rPr>
+                <w:sz w:val="18"/>
+              </w:rPr>
+              <w:t>Menu:TrainOrders</w:t>
+              <w:br/>
+              <w:br/>
+            </w:r>
+            <w:r>
+              <w:rPr>
+                <w:sz w:val="16"/>
+              </w:rPr>
+              <w:t>Menu:Booking - Menu:TrainOrders</w:t>
+            </w:r>
+          </w:p>
+        </w:tc>
+        <w:tc>
+          <w:tcPr>
+            <w:tcW w:type="dxa" w:w="5760"/>
+          </w:tcPr>
+          <w:p/>
+        </w:tc>
+      </w:tr>
+      <w:tr>
+        <w:tc>
+          <w:tcPr>
+            <w:tcW w:type="dxa" w:w="720"/>
+          </w:tcPr>
+          <w:p>
+            <w:pPr>
+              <w:jc w:val="center"/>
+            </w:pPr>
+            <w:r>
+              <w:t>11</w:t>
+            </w:r>
+          </w:p>
+        </w:tc>
+        <w:tc>
+          <w:tcPr>
+            <w:tcW w:type="dxa" w:w="3600"/>
+          </w:tcPr>
+          <w:p>
+            <w:r>
+              <w:rPr>
+                <w:b/>
+              </w:rPr>
+              <w:t>【Menu:Booking】</w:t>
+              <w:br/>
+            </w:r>
+            <w:r>
+              <w:rPr>
+                <w:sz w:val="18"/>
+              </w:rPr>
+              <w:t>Coaches</w:t>
+              <w:br/>
+              <w:br/>
+            </w:r>
+            <w:r>
+              <w:rPr>
+                <w:sz w:val="16"/>
+              </w:rPr>
+              <w:t>Menu:Booking - Coaches</w:t>
+            </w:r>
+          </w:p>
+        </w:tc>
+        <w:tc>
+          <w:tcPr>
+            <w:tcW w:type="dxa" w:w="5760"/>
+          </w:tcPr>
+          <w:p/>
+        </w:tc>
+      </w:tr>
+      <w:tr>
+        <w:tc>
+          <w:tcPr>
+            <w:tcW w:type="dxa" w:w="720"/>
+          </w:tcPr>
+          <w:p>
+            <w:pPr>
+              <w:jc w:val="center"/>
+            </w:pPr>
+            <w:r>
+              <w:t>12</w:t>
+            </w:r>
+          </w:p>
+        </w:tc>
+        <w:tc>
+          <w:tcPr>
+            <w:tcW w:type="dxa" w:w="3600"/>
+          </w:tcPr>
+          <w:p>
+            <w:r>
+              <w:rPr>
+                <w:b/>
+              </w:rPr>
+              <w:t>【Menu:Booking】</w:t>
+              <w:br/>
+            </w:r>
+            <w:r>
+              <w:rPr>
+                <w:sz w:val="18"/>
+              </w:rPr>
+              <w:t>Training Managements</w:t>
+              <w:br/>
+              <w:br/>
+            </w:r>
+            <w:r>
+              <w:rPr>
+                <w:sz w:val="16"/>
+              </w:rPr>
+              <w:t>Menu:Booking - Training Managements</w:t>
+            </w:r>
+          </w:p>
+        </w:tc>
+        <w:tc>
+          <w:tcPr>
+            <w:tcW w:type="dxa" w:w="5760"/>
+          </w:tcPr>
+          <w:p/>
+        </w:tc>
+      </w:tr>
+      <w:tr>
+        <w:tc>
+          <w:tcPr>
+            <w:tcW w:type="dxa" w:w="720"/>
+          </w:tcPr>
+          <w:p>
+            <w:pPr>
+              <w:jc w:val="center"/>
+            </w:pPr>
+            <w:r>
+              <w:t>13</w:t>
+            </w:r>
+          </w:p>
+        </w:tc>
+        <w:tc>
+          <w:tcPr>
+            <w:tcW w:type="dxa" w:w="3600"/>
+          </w:tcPr>
+          <w:p>
+            <w:r>
+              <w:rPr>
+                <w:b/>
+              </w:rPr>
+              <w:t>【Menu:Booking】</w:t>
+              <w:br/>
+            </w:r>
+            <w:r>
+              <w:rPr>
+                <w:sz w:val="18"/>
+              </w:rPr>
+              <w:t>Training Managements - 新增</w:t>
+              <w:br/>
+              <w:br/>
+            </w:r>
+            <w:r>
+              <w:rPr>
+                <w:sz w:val="16"/>
+              </w:rPr>
+              <w:t>新增功能</w:t>
+            </w:r>
+          </w:p>
+        </w:tc>
+        <w:tc>
+          <w:tcPr>
+            <w:tcW w:type="dxa" w:w="5760"/>
+          </w:tcPr>
+          <w:p/>
+        </w:tc>
+      </w:tr>
+      <w:tr>
+        <w:tc>
+          <w:tcPr>
+            <w:tcW w:type="dxa" w:w="720"/>
+          </w:tcPr>
+          <w:p>
+            <w:pPr>
+              <w:jc w:val="center"/>
+            </w:pPr>
+            <w:r>
+              <w:t>14</w:t>
+            </w:r>
+          </w:p>
+        </w:tc>
+        <w:tc>
+          <w:tcPr>
+            <w:tcW w:type="dxa" w:w="3600"/>
+          </w:tcPr>
+          <w:p>
+            <w:r>
+              <w:rPr>
+                <w:b/>
+              </w:rPr>
+              <w:t>【Menu:Booking】</w:t>
+              <w:br/>
+            </w:r>
+            <w:r>
+              <w:rPr>
+                <w:sz w:val="18"/>
+              </w:rPr>
+              <w:t>Products</w:t>
+              <w:br/>
+              <w:br/>
+            </w:r>
+            <w:r>
+              <w:rPr>
+                <w:sz w:val="16"/>
+              </w:rPr>
+              <w:t>Menu:Booking - Products</w:t>
+            </w:r>
+          </w:p>
+        </w:tc>
+        <w:tc>
+          <w:tcPr>
+            <w:tcW w:type="dxa" w:w="5760"/>
+          </w:tcPr>
+          <w:p/>
+        </w:tc>
+      </w:tr>
+      <w:tr>
+        <w:tc>
+          <w:tcPr>
+            <w:tcW w:type="dxa" w:w="720"/>
+          </w:tcPr>
+          <w:p>
+            <w:pPr>
+              <w:jc w:val="center"/>
+            </w:pPr>
+            <w:r>
+              <w:t>15</w:t>
+            </w:r>
+          </w:p>
+        </w:tc>
+        <w:tc>
+          <w:tcPr>
+            <w:tcW w:type="dxa" w:w="3600"/>
+          </w:tcPr>
+          <w:p>
+            <w:r>
+              <w:rPr>
+                <w:b/>
+              </w:rPr>
+              <w:t>【Menu:LeasesMian】</w:t>
+              <w:br/>
+            </w:r>
+            <w:r>
+              <w:rPr>
+                <w:sz w:val="18"/>
+              </w:rPr>
+              <w:t>Menu:Work</w:t>
+              <w:br/>
+              <w:br/>
+            </w:r>
+            <w:r>
+              <w:rPr>
+                <w:sz w:val="16"/>
+              </w:rPr>
+              <w:t>Menu:LeasesMian - Menu:Work</w:t>
+            </w:r>
+          </w:p>
+        </w:tc>
+        <w:tc>
+          <w:tcPr>
+            <w:tcW w:type="dxa" w:w="5760"/>
+          </w:tcPr>
+          <w:p/>
+        </w:tc>
+      </w:tr>
+      <w:tr>
+        <w:tc>
+          <w:tcPr>
+            <w:tcW w:type="dxa" w:w="720"/>
+          </w:tcPr>
+          <w:p>
+            <w:pPr>
+              <w:jc w:val="center"/>
+            </w:pPr>
+            <w:r>
+              <w:t>16</w:t>
+            </w:r>
+          </w:p>
+        </w:tc>
+        <w:tc>
+          <w:tcPr>
+            <w:tcW w:type="dxa" w:w="3600"/>
+          </w:tcPr>
+          <w:p>
+            <w:r>
+              <w:rPr>
+                <w:b/>
+              </w:rPr>
+              <w:t>【Menu:LeasesMian】</w:t>
+              <w:br/>
+            </w:r>
+            <w:r>
+              <w:rPr>
+                <w:sz w:val="18"/>
+              </w:rPr>
+              <w:t>Menu:Leases</w:t>
+              <w:br/>
+              <w:br/>
+            </w:r>
+            <w:r>
+              <w:rPr>
+                <w:sz w:val="16"/>
+              </w:rPr>
+              <w:t>Menu:LeasesMian - Menu:Leases</w:t>
+            </w:r>
+          </w:p>
+        </w:tc>
+        <w:tc>
+          <w:tcPr>
+            <w:tcW w:type="dxa" w:w="5760"/>
+          </w:tcPr>
+          <w:p/>
+        </w:tc>
+      </w:tr>
+      <w:tr>
+        <w:tc>
+          <w:tcPr>
+            <w:tcW w:type="dxa" w:w="720"/>
+          </w:tcPr>
+          <w:p>
+            <w:pPr>
+              <w:jc w:val="center"/>
+            </w:pPr>
+            <w:r>
+              <w:t>17</w:t>
+            </w:r>
+          </w:p>
+        </w:tc>
+        <w:tc>
+          <w:tcPr>
+            <w:tcW w:type="dxa" w:w="3600"/>
+          </w:tcPr>
+          <w:p>
+            <w:r>
+              <w:rPr>
+                <w:b/>
+              </w:rPr>
+              <w:t>【Menu:LeasesMian】</w:t>
+              <w:br/>
+            </w:r>
+            <w:r>
+              <w:rPr>
+                <w:sz w:val="18"/>
+              </w:rPr>
+              <w:t>Products</w:t>
+              <w:br/>
+              <w:br/>
+            </w:r>
+            <w:r>
+              <w:rPr>
+                <w:sz w:val="16"/>
+              </w:rPr>
+              <w:t>Menu:LeasesMian - Products</w:t>
+            </w:r>
+          </w:p>
+        </w:tc>
+        <w:tc>
+          <w:tcPr>
+            <w:tcW w:type="dxa" w:w="5760"/>
+          </w:tcPr>
+          <w:p/>
+        </w:tc>
+      </w:tr>
+      <w:tr>
+        <w:tc>
+          <w:tcPr>
+            <w:tcW w:type="dxa" w:w="720"/>
+          </w:tcPr>
+          <w:p>
+            <w:pPr>
+              <w:jc w:val="center"/>
+            </w:pPr>
+            <w:r>
+              <w:t>18</w:t>
+            </w:r>
+          </w:p>
+        </w:tc>
+        <w:tc>
+          <w:tcPr>
+            <w:tcW w:type="dxa" w:w="3600"/>
+          </w:tcPr>
+          <w:p>
+            <w:r>
+              <w:rPr>
+                <w:b/>
+              </w:rPr>
+              <w:t>【Distributors】</w:t>
+              <w:br/>
+            </w:r>
+            <w:r>
+              <w:rPr>
+                <w:sz w:val="18"/>
+              </w:rPr>
+              <w:t>Distributors</w:t>
+              <w:br/>
+              <w:br/>
+            </w:r>
+            <w:r>
+              <w:rPr>
+                <w:sz w:val="16"/>
+              </w:rPr>
+              <w:t>Distributors - Distributors</w:t>
+            </w:r>
+          </w:p>
+        </w:tc>
+        <w:tc>
+          <w:tcPr>
+            <w:tcW w:type="dxa" w:w="5760"/>
+          </w:tcPr>
+          <w:p/>
+        </w:tc>
+      </w:tr>
+      <w:tr>
+        <w:tc>
+          <w:tcPr>
+            <w:tcW w:type="dxa" w:w="720"/>
+          </w:tcPr>
+          <w:p>
+            <w:pPr>
+              <w:jc w:val="center"/>
+            </w:pPr>
+            <w:r>
+              <w:t>19</w:t>
+            </w:r>
+          </w:p>
+        </w:tc>
+        <w:tc>
+          <w:tcPr>
+            <w:tcW w:type="dxa" w:w="3600"/>
+          </w:tcPr>
+          <w:p>
+            <w:r>
+              <w:rPr>
+                <w:b/>
+              </w:rPr>
+              <w:t>【Distributors】</w:t>
+              <w:br/>
+            </w:r>
+            <w:r>
+              <w:rPr>
+                <w:sz w:val="18"/>
+              </w:rPr>
+              <w:t>Distributors - 新增</w:t>
+              <w:br/>
+              <w:br/>
+            </w:r>
+            <w:r>
+              <w:rPr>
+                <w:sz w:val="16"/>
+              </w:rPr>
+              <w:t>新增功能</w:t>
+            </w:r>
+          </w:p>
+        </w:tc>
+        <w:tc>
+          <w:tcPr>
+            <w:tcW w:type="dxa" w:w="5760"/>
+          </w:tcPr>
+          <w:p/>
+        </w:tc>
+      </w:tr>
+      <w:tr>
+        <w:tc>
+          <w:tcPr>
+            <w:tcW w:type="dxa" w:w="720"/>
+          </w:tcPr>
+          <w:p>
+            <w:pPr>
+              <w:jc w:val="center"/>
+            </w:pPr>
+            <w:r>
+              <w:t>20</w:t>
+            </w:r>
+          </w:p>
+        </w:tc>
+        <w:tc>
+          <w:tcPr>
+            <w:tcW w:type="dxa" w:w="3600"/>
+          </w:tcPr>
+          <w:p>
+            <w:r>
+              <w:rPr>
+                <w:b/>
+              </w:rPr>
+              <w:t>【Distributors】</w:t>
+              <w:br/>
+            </w:r>
+            <w:r>
+              <w:rPr>
+                <w:sz w:val="18"/>
+              </w:rPr>
+              <w:t>Distributor Tickets</w:t>
+              <w:br/>
+              <w:br/>
+            </w:r>
+            <w:r>
+              <w:rPr>
+                <w:sz w:val="16"/>
+              </w:rPr>
+              <w:t>Distributors - Distributor Tickets</w:t>
+            </w:r>
+          </w:p>
+        </w:tc>
+        <w:tc>
+          <w:tcPr>
+            <w:tcW w:type="dxa" w:w="5760"/>
+          </w:tcPr>
+          <w:p/>
+        </w:tc>
+      </w:tr>
+      <w:tr>
+        <w:tc>
+          <w:tcPr>
+            <w:tcW w:type="dxa" w:w="720"/>
+          </w:tcPr>
+          <w:p>
+            <w:pPr>
+              <w:jc w:val="center"/>
+            </w:pPr>
+            <w:r>
+              <w:t>21</w:t>
+            </w:r>
+          </w:p>
+        </w:tc>
+        <w:tc>
+          <w:tcPr>
+            <w:tcW w:type="dxa" w:w="3600"/>
+          </w:tcPr>
+          <w:p>
+            <w:r>
+              <w:rPr>
+                <w:b/>
+              </w:rPr>
+              <w:t>【Distributors】</w:t>
+              <w:br/>
+            </w:r>
+            <w:r>
+              <w:rPr>
+                <w:sz w:val="18"/>
+              </w:rPr>
+              <w:t>Distributor Tickets - 新增</w:t>
+              <w:br/>
+              <w:br/>
+            </w:r>
+            <w:r>
+              <w:rPr>
+                <w:sz w:val="16"/>
+              </w:rPr>
+              <w:t>新增功能</w:t>
+            </w:r>
+          </w:p>
+        </w:tc>
+        <w:tc>
+          <w:tcPr>
+            <w:tcW w:type="dxa" w:w="5760"/>
+          </w:tcPr>
+          <w:p/>
+        </w:tc>
+      </w:tr>
+      <w:tr>
+        <w:tc>
+          <w:tcPr>
+            <w:tcW w:type="dxa" w:w="720"/>
+          </w:tcPr>
+          <w:p>
+            <w:pPr>
+              <w:jc w:val="center"/>
+            </w:pPr>
+            <w:r>
+              <w:t>22</w:t>
+            </w:r>
+          </w:p>
+        </w:tc>
+        <w:tc>
+          <w:tcPr>
+            <w:tcW w:type="dxa" w:w="3600"/>
+          </w:tcPr>
+          <w:p>
+            <w:r>
+              <w:rPr>
+                <w:b/>
+              </w:rPr>
+              <w:t>【Distributors】</w:t>
+              <w:br/>
+            </w:r>
+            <w:r>
+              <w:rPr>
+                <w:sz w:val="18"/>
+              </w:rPr>
+              <w:t>Distributor Tickets - 搜索</w:t>
+              <w:br/>
+              <w:br/>
+            </w:r>
+            <w:r>
+              <w:rPr>
+                <w:sz w:val="16"/>
+              </w:rPr>
+              <w:t>搜索功能</w:t>
+            </w:r>
+          </w:p>
+        </w:tc>
+        <w:tc>
+          <w:tcPr>
+            <w:tcW w:type="dxa" w:w="5760"/>
+          </w:tcPr>
+          <w:p/>
+        </w:tc>
+      </w:tr>
+      <w:tr>
+        <w:tc>
+          <w:tcPr>
+            <w:tcW w:type="dxa" w:w="720"/>
+          </w:tcPr>
+          <w:p>
+            <w:pPr>
+              <w:jc w:val="center"/>
+            </w:pPr>
+            <w:r>
+              <w:t>23</w:t>
+            </w:r>
+          </w:p>
+        </w:tc>
+        <w:tc>
+          <w:tcPr>
+            <w:tcW w:type="dxa" w:w="3600"/>
+          </w:tcPr>
+          <w:p>
+            <w:r>
+              <w:rPr>
+                <w:b/>
+              </w:rPr>
+              <w:t>【Distributors】</w:t>
+              <w:br/>
+            </w:r>
+            <w:r>
+              <w:rPr>
+                <w:sz w:val="18"/>
+              </w:rPr>
+              <w:t>Distributorlevels</w:t>
+              <w:br/>
+              <w:br/>
+            </w:r>
+            <w:r>
+              <w:rPr>
+                <w:sz w:val="16"/>
+              </w:rPr>
+              <w:t>Distributors - Distributorlevels</w:t>
+            </w:r>
+          </w:p>
+        </w:tc>
+        <w:tc>
+          <w:tcPr>
+            <w:tcW w:type="dxa" w:w="5760"/>
+          </w:tcPr>
+          <w:p/>
+        </w:tc>
+      </w:tr>
+      <w:tr>
+        <w:tc>
+          <w:tcPr>
+            <w:tcW w:type="dxa" w:w="720"/>
+          </w:tcPr>
+          <w:p>
+            <w:pPr>
+              <w:jc w:val="center"/>
+            </w:pPr>
+            <w:r>
+              <w:t>24</w:t>
+            </w:r>
+          </w:p>
+        </w:tc>
+        <w:tc>
+          <w:tcPr>
+            <w:tcW w:type="dxa" w:w="3600"/>
+          </w:tcPr>
+          <w:p>
+            <w:r>
+              <w:rPr>
+                <w:b/>
+              </w:rPr>
+              <w:t>【Distributors】</w:t>
+              <w:br/>
+            </w:r>
+            <w:r>
+              <w:rPr>
+                <w:sz w:val="18"/>
+              </w:rPr>
+              <w:t>Distributorlevels - New Distributorlevel</w:t>
+              <w:br/>
+              <w:br/>
+            </w:r>
+            <w:r>
+              <w:rPr>
+                <w:sz w:val="16"/>
+              </w:rPr>
+              <w:t>New Distributorlevel功能</w:t>
+            </w:r>
+          </w:p>
+        </w:tc>
+        <w:tc>
+          <w:tcPr>
+            <w:tcW w:type="dxa" w:w="5760"/>
+          </w:tcPr>
+          <w:p/>
+        </w:tc>
+      </w:tr>
+      <w:tr>
+        <w:tc>
+          <w:tcPr>
+            <w:tcW w:type="dxa" w:w="720"/>
+          </w:tcPr>
+          <w:p>
+            <w:pPr>
+              <w:jc w:val="center"/>
+            </w:pPr>
+            <w:r>
+              <w:t>25</w:t>
+            </w:r>
+          </w:p>
+        </w:tc>
+        <w:tc>
+          <w:tcPr>
+            <w:tcW w:type="dxa" w:w="3600"/>
+          </w:tcPr>
+          <w:p>
+            <w:r>
+              <w:rPr>
+                <w:b/>
+              </w:rPr>
+              <w:t>【Menu:MiniprogramSetting】</w:t>
+              <w:br/>
+            </w:r>
+            <w:r>
+              <w:rPr>
+                <w:sz w:val="18"/>
+              </w:rPr>
+              <w:t>Index Design</w:t>
+              <w:br/>
+              <w:br/>
+            </w:r>
+            <w:r>
+              <w:rPr>
+                <w:sz w:val="16"/>
+              </w:rPr>
+              <w:t>Menu:MiniprogramSetting - Index Design</w:t>
+            </w:r>
+          </w:p>
+        </w:tc>
+        <w:tc>
+          <w:tcPr>
+            <w:tcW w:type="dxa" w:w="5760"/>
+          </w:tcPr>
+          <w:p/>
+        </w:tc>
+      </w:tr>
+      <w:tr>
+        <w:tc>
+          <w:tcPr>
+            <w:tcW w:type="dxa" w:w="720"/>
+          </w:tcPr>
+          <w:p>
+            <w:pPr>
+              <w:jc w:val="center"/>
+            </w:pPr>
+            <w:r>
+              <w:t>26</w:t>
+            </w:r>
+          </w:p>
+        </w:tc>
+        <w:tc>
+          <w:tcPr>
+            <w:tcW w:type="dxa" w:w="3600"/>
+          </w:tcPr>
+          <w:p>
+            <w:r>
+              <w:rPr>
+                <w:b/>
+              </w:rPr>
+              <w:t>【Menu:MiniprogramSetting】</w:t>
+              <w:br/>
+            </w:r>
+            <w:r>
+              <w:rPr>
+                <w:sz w:val="18"/>
+              </w:rPr>
+              <w:t>限流管理</w:t>
+              <w:br/>
+              <w:br/>
+            </w:r>
+            <w:r>
+              <w:rPr>
+                <w:sz w:val="16"/>
+              </w:rPr>
+              <w:t>Menu:MiniprogramSetting - 限流管理</w:t>
+            </w:r>
+          </w:p>
+        </w:tc>
+        <w:tc>
+          <w:tcPr>
+            <w:tcW w:type="dxa" w:w="5760"/>
+          </w:tcPr>
+          <w:p/>
+        </w:tc>
+      </w:tr>
+      <w:tr>
+        <w:tc>
+          <w:tcPr>
+            <w:tcW w:type="dxa" w:w="720"/>
+          </w:tcPr>
+          <w:p>
+            <w:pPr>
+              <w:jc w:val="center"/>
+            </w:pPr>
+            <w:r>
+              <w:t>27</w:t>
+            </w:r>
+          </w:p>
+        </w:tc>
+        <w:tc>
+          <w:tcPr>
+            <w:tcW w:type="dxa" w:w="3600"/>
+          </w:tcPr>
+          <w:p>
+            <w:r>
+              <w:rPr>
+                <w:b/>
+              </w:rPr>
+              <w:t>【Menu:MiniprogramSetting】</w:t>
+              <w:br/>
+            </w:r>
+            <w:r>
+              <w:rPr>
+                <w:sz w:val="18"/>
+              </w:rPr>
+              <w:t>Service Categories</w:t>
+              <w:br/>
+              <w:br/>
+            </w:r>
+            <w:r>
+              <w:rPr>
+                <w:sz w:val="16"/>
+              </w:rPr>
+              <w:t>Menu:MiniprogramSetting - Service Categories</w:t>
+            </w:r>
+          </w:p>
+        </w:tc>
+        <w:tc>
+          <w:tcPr>
+            <w:tcW w:type="dxa" w:w="5760"/>
+          </w:tcPr>
+          <w:p/>
+        </w:tc>
+      </w:tr>
+      <w:tr>
+        <w:tc>
+          <w:tcPr>
+            <w:tcW w:type="dxa" w:w="720"/>
+          </w:tcPr>
+          <w:p>
+            <w:pPr>
+              <w:jc w:val="center"/>
+            </w:pPr>
+            <w:r>
+              <w:t>28</w:t>
+            </w:r>
+          </w:p>
+        </w:tc>
+        <w:tc>
+          <w:tcPr>
+            <w:tcW w:type="dxa" w:w="3600"/>
+          </w:tcPr>
+          <w:p>
+            <w:r>
+              <w:rPr>
+                <w:b/>
+              </w:rPr>
+              <w:t>【Menu:MiniprogramSetting】</w:t>
+              <w:br/>
+            </w:r>
+            <w:r>
+              <w:rPr>
+                <w:sz w:val="18"/>
+              </w:rPr>
+              <w:t>Service Categories - New Service Category</w:t>
+              <w:br/>
+              <w:br/>
+            </w:r>
+            <w:r>
+              <w:rPr>
+                <w:sz w:val="16"/>
+              </w:rPr>
+              <w:t>New Service Category功能</w:t>
+            </w:r>
+          </w:p>
+        </w:tc>
+        <w:tc>
+          <w:tcPr>
+            <w:tcW w:type="dxa" w:w="5760"/>
+          </w:tcPr>
+          <w:p/>
+        </w:tc>
+      </w:tr>
+      <w:tr>
+        <w:tc>
+          <w:tcPr>
+            <w:tcW w:type="dxa" w:w="720"/>
+          </w:tcPr>
+          <w:p>
+            <w:pPr>
+              <w:jc w:val="center"/>
+            </w:pPr>
+            <w:r>
+              <w:t>29</w:t>
+            </w:r>
+          </w:p>
+        </w:tc>
+        <w:tc>
+          <w:tcPr>
+            <w:tcW w:type="dxa" w:w="3600"/>
+          </w:tcPr>
+          <w:p>
+            <w:r>
+              <w:rPr>
+                <w:b/>
+              </w:rPr>
+              <w:t>【Menu:MiniprogramSetting】</w:t>
+              <w:br/>
+            </w:r>
+            <w:r>
+              <w:rPr>
+                <w:sz w:val="18"/>
+              </w:rPr>
+              <w:t>Service Categories - New Service Item</w:t>
+              <w:br/>
+              <w:br/>
+            </w:r>
+            <w:r>
+              <w:rPr>
+                <w:sz w:val="16"/>
+              </w:rPr>
+              <w:t>New Service Item功能</w:t>
+            </w:r>
+          </w:p>
+        </w:tc>
+        <w:tc>
+          <w:tcPr>
+            <w:tcW w:type="dxa" w:w="5760"/>
+          </w:tcPr>
+          <w:p/>
+        </w:tc>
+      </w:tr>
+      <w:tr>
+        <w:tc>
+          <w:tcPr>
+            <w:tcW w:type="dxa" w:w="720"/>
+          </w:tcPr>
+          <w:p>
+            <w:pPr>
+              <w:jc w:val="center"/>
+            </w:pPr>
+            <w:r>
+              <w:t>30</w:t>
+            </w:r>
+          </w:p>
+        </w:tc>
+        <w:tc>
+          <w:tcPr>
+            <w:tcW w:type="dxa" w:w="3600"/>
+          </w:tcPr>
+          <w:p>
+            <w:r>
+              <w:rPr>
+                <w:b/>
+              </w:rPr>
+              <w:t>【Menu:MiniprogramSetting】</w:t>
+              <w:br/>
+            </w:r>
+            <w:r>
+              <w:rPr>
+                <w:sz w:val="18"/>
+              </w:rPr>
+              <w:t>Notify Templates</w:t>
+              <w:br/>
+              <w:br/>
+            </w:r>
+            <w:r>
+              <w:rPr>
+                <w:sz w:val="16"/>
+              </w:rPr>
+              <w:t>Menu:MiniprogramSetting - Notify Templates</w:t>
+            </w:r>
+          </w:p>
+        </w:tc>
+        <w:tc>
+          <w:tcPr>
+            <w:tcW w:type="dxa" w:w="5760"/>
+          </w:tcPr>
+          <w:p/>
+        </w:tc>
+      </w:tr>
+      <w:tr>
+        <w:tc>
+          <w:tcPr>
+            <w:tcW w:type="dxa" w:w="720"/>
+          </w:tcPr>
+          <w:p>
+            <w:pPr>
+              <w:jc w:val="center"/>
+            </w:pPr>
+            <w:r>
+              <w:t>31</w:t>
+            </w:r>
+          </w:p>
+        </w:tc>
+        <w:tc>
+          <w:tcPr>
+            <w:tcW w:type="dxa" w:w="3600"/>
+          </w:tcPr>
+          <w:p>
+            <w:r>
+              <w:rPr>
+                <w:b/>
+              </w:rPr>
+              <w:t>【Menu:MiniprogramSetting】</w:t>
+              <w:br/>
+            </w:r>
+            <w:r>
+              <w:rPr>
+                <w:sz w:val="18"/>
+              </w:rPr>
+              <w:t>Notify Templates - New Notify Template</w:t>
+              <w:br/>
+              <w:br/>
+            </w:r>
+            <w:r>
+              <w:rPr>
+                <w:sz w:val="16"/>
+              </w:rPr>
+              <w:t>New Notify Template功能</w:t>
+            </w:r>
+          </w:p>
+        </w:tc>
+        <w:tc>
+          <w:tcPr>
+            <w:tcW w:type="dxa" w:w="5760"/>
+          </w:tcPr>
+          <w:p/>
+        </w:tc>
+      </w:tr>
+      <w:tr>
+        <w:tc>
+          <w:tcPr>
+            <w:tcW w:type="dxa" w:w="720"/>
+          </w:tcPr>
+          <w:p>
+            <w:pPr>
+              <w:jc w:val="center"/>
+            </w:pPr>
+            <w:r>
+              <w:t>32</w:t>
+            </w:r>
+          </w:p>
+        </w:tc>
+        <w:tc>
+          <w:tcPr>
+            <w:tcW w:type="dxa" w:w="3600"/>
+          </w:tcPr>
+          <w:p>
+            <w:r>
+              <w:rPr>
+                <w:b/>
+              </w:rPr>
+              <w:t>【Menu:ReceiversInit】</w:t>
+              <w:br/>
+            </w:r>
+            <w:r>
+              <w:rPr>
+                <w:sz w:val="18"/>
+              </w:rPr>
+              <w:t>Menu:OrderProfitSharingsRage</w:t>
+              <w:br/>
+              <w:br/>
+            </w:r>
+            <w:r>
+              <w:rPr>
+                <w:sz w:val="16"/>
+              </w:rPr>
+              <w:t>Menu:ReceiversInit - Menu:OrderProfitSharingsRage</w:t>
+            </w:r>
+          </w:p>
+        </w:tc>
+        <w:tc>
+          <w:tcPr>
+            <w:tcW w:type="dxa" w:w="5760"/>
+          </w:tcPr>
+          <w:p/>
+        </w:tc>
+      </w:tr>
+      <w:tr>
+        <w:tc>
+          <w:tcPr>
+            <w:tcW w:type="dxa" w:w="720"/>
+          </w:tcPr>
+          <w:p>
+            <w:pPr>
+              <w:jc w:val="center"/>
+            </w:pPr>
+            <w:r>
+              <w:t>33</w:t>
+            </w:r>
+          </w:p>
+        </w:tc>
+        <w:tc>
+          <w:tcPr>
+            <w:tcW w:type="dxa" w:w="3600"/>
+          </w:tcPr>
+          <w:p>
+            <w:r>
+              <w:rPr>
+                <w:b/>
+              </w:rPr>
+              <w:t>【Menu:ReceiversInit】</w:t>
+              <w:br/>
+            </w:r>
+            <w:r>
+              <w:rPr>
+                <w:sz w:val="18"/>
+              </w:rPr>
+              <w:t>Order Profit Sharings</w:t>
+              <w:br/>
+              <w:br/>
+            </w:r>
+            <w:r>
+              <w:rPr>
+                <w:sz w:val="16"/>
+              </w:rPr>
+              <w:t>Menu:ReceiversInit - Order Profit Sharings</w:t>
             </w:r>
           </w:p>
         </w:tc>
@@ -346,7 +1820,7 @@
                     <a:graphicData uri="http://schemas.openxmlformats.org/drawingml/2006/picture">
                       <pic:pic>
                         <pic:nvPicPr>
-                          <pic:cNvPr id="0" name="0003_Menu_Ticket_Menu_Ticket.png"/>
+                          <pic:cNvPr id="0" name="0033_Menu_ReceiversInit_Order Profit Sharings.png"/>
                           <pic:cNvPicPr/>
                         </pic:nvPicPr>
                         <pic:blipFill>
@@ -381,7 +1855,7 @@
               <w:jc w:val="center"/>
             </w:pPr>
             <w:r>
-              <w:t>4</w:t>
+              <w:t>34</w:t>
             </w:r>
           </w:p>
         </w:tc>
@@ -393,16 +1867,15 @@
             <w:r>
               <w:rPr>
                 <w:b/>
-                <w:sz w:val="20"/>
               </w:rPr>
-              <w:t>【Menu:Booking】</w:t>
+              <w:t>【Menu:ReceiversInit】</w:t>
               <w:br/>
             </w:r>
             <w:r>
               <w:rPr>
                 <w:sz w:val="18"/>
               </w:rPr>
-              <w:t>Menu:Booking</w:t>
+              <w:t>Order Receivers</w:t>
               <w:br/>
               <w:br/>
             </w:r>
@@ -410,7 +1883,7 @@
               <w:rPr>
                 <w:sz w:val="16"/>
               </w:rPr>
-              <w:t>Menu:Booking页面</w:t>
+              <w:t>Menu:ReceiversInit - Order Receivers</w:t>
             </w:r>
           </w:p>
         </w:tc>
@@ -434,7 +1907,7 @@
                     <a:graphicData uri="http://schemas.openxmlformats.org/drawingml/2006/picture">
                       <pic:pic>
                         <pic:nvPicPr>
-                          <pic:cNvPr id="0" name="0004_Menu_Booking_Menu_Booking.png"/>
+                          <pic:cNvPr id="0" name="0034_Menu_ReceiversInit_Order Receivers.png"/>
                           <pic:cNvPicPr/>
                         </pic:nvPicPr>
                         <pic:blipFill>
@@ -469,7 +1942,7 @@
               <w:jc w:val="center"/>
             </w:pPr>
             <w:r>
-              <w:t>5</w:t>
+              <w:t>35</w:t>
             </w:r>
           </w:p>
         </w:tc>
@@ -481,16 +1954,15 @@
             <w:r>
               <w:rPr>
                 <w:b/>
-                <w:sz w:val="20"/>
               </w:rPr>
-              <w:t>【Menu:LeasesMian】</w:t>
+              <w:t>【Menu:ReceiversInit】</w:t>
               <w:br/>
             </w:r>
             <w:r>
               <w:rPr>
                 <w:sz w:val="18"/>
               </w:rPr>
-              <w:t>Menu:LeasesMian</w:t>
+              <w:t>Order Receivers - New Order Receiver</w:t>
               <w:br/>
               <w:br/>
             </w:r>
@@ -498,7 +1970,7 @@
               <w:rPr>
                 <w:sz w:val="16"/>
               </w:rPr>
-              <w:t>Menu:LeasesMian页面</w:t>
+              <w:t>New Order Receiver功能</w:t>
             </w:r>
           </w:p>
         </w:tc>
@@ -522,7 +1994,7 @@
                     <a:graphicData uri="http://schemas.openxmlformats.org/drawingml/2006/picture">
                       <pic:pic>
                         <pic:nvPicPr>
-                          <pic:cNvPr id="0" name="0005_Menu_LeasesMian_Menu_LeasesMian.png"/>
+                          <pic:cNvPr id="0" name="0035_Menu_ReceiversInit_Order Receivers - New Order Receiver.png"/>
                           <pic:cNvPicPr/>
                         </pic:nvPicPr>
                         <pic:blipFill>
@@ -557,7 +2029,7 @@
               <w:jc w:val="center"/>
             </w:pPr>
             <w:r>
-              <w:t>6</w:t>
+              <w:t>36</w:t>
             </w:r>
           </w:p>
         </w:tc>
@@ -569,16 +2041,15 @@
             <w:r>
               <w:rPr>
                 <w:b/>
-                <w:sz w:val="20"/>
               </w:rPr>
-              <w:t>【Distributors】</w:t>
+              <w:t>【Menu:Reports】</w:t>
               <w:br/>
             </w:r>
             <w:r>
               <w:rPr>
                 <w:sz w:val="18"/>
               </w:rPr>
-              <w:t>Distributors</w:t>
+              <w:t>Menu:WriteOffItemsTicket</w:t>
               <w:br/>
               <w:br/>
             </w:r>
@@ -586,7 +2057,7 @@
               <w:rPr>
                 <w:sz w:val="16"/>
               </w:rPr>
-              <w:t>Distributors页面</w:t>
+              <w:t>Menu:Reports - Menu:WriteOffItemsTicket</w:t>
             </w:r>
           </w:p>
         </w:tc>
@@ -610,7 +2081,7 @@
                     <a:graphicData uri="http://schemas.openxmlformats.org/drawingml/2006/picture">
                       <pic:pic>
                         <pic:nvPicPr>
-                          <pic:cNvPr id="0" name="0006_Distributors_Distributors.png"/>
+                          <pic:cNvPr id="0" name="0036_Menu_Reports_Menu_WriteOffItemsTicket.png"/>
                           <pic:cNvPicPr/>
                         </pic:nvPicPr>
                         <pic:blipFill>
@@ -645,7 +2116,7 @@
               <w:jc w:val="center"/>
             </w:pPr>
             <w:r>
-              <w:t>7</w:t>
+              <w:t>37</w:t>
             </w:r>
           </w:p>
         </w:tc>
@@ -657,16 +2128,15 @@
             <w:r>
               <w:rPr>
                 <w:b/>
-                <w:sz w:val="20"/>
               </w:rPr>
-              <w:t>【Menu:MiniprogramSetting】</w:t>
+              <w:t>【Menu:Reports】</w:t>
               <w:br/>
             </w:r>
             <w:r>
               <w:rPr>
                 <w:sz w:val="18"/>
               </w:rPr>
-              <w:t>Menu:MiniprogramSetting</w:t>
+              <w:t>Menu:TranWriteOffReport</w:t>
               <w:br/>
               <w:br/>
             </w:r>
@@ -674,7 +2144,7 @@
               <w:rPr>
                 <w:sz w:val="16"/>
               </w:rPr>
-              <w:t>Menu:MiniprogramSetting页面</w:t>
+              <w:t>Menu:Reports - Menu:TranWriteOffReport</w:t>
             </w:r>
           </w:p>
         </w:tc>
@@ -698,7 +2168,7 @@
                     <a:graphicData uri="http://schemas.openxmlformats.org/drawingml/2006/picture">
                       <pic:pic>
                         <pic:nvPicPr>
-                          <pic:cNvPr id="0" name="0007_Menu_MiniprogramSetting_Menu_MiniprogramSetting.png"/>
+                          <pic:cNvPr id="0" name="0037_Menu_Reports_Menu_TranWriteOffReport.png"/>
                           <pic:cNvPicPr/>
                         </pic:nvPicPr>
                         <pic:blipFill>
@@ -733,7 +2203,7 @@
               <w:jc w:val="center"/>
             </w:pPr>
             <w:r>
-              <w:t>8</w:t>
+              <w:t>38</w:t>
             </w:r>
           </w:p>
         </w:tc>
@@ -745,16 +2215,15 @@
             <w:r>
               <w:rPr>
                 <w:b/>
-                <w:sz w:val="20"/>
               </w:rPr>
-              <w:t>【13811458301】</w:t>
+              <w:t>【Menu:Reports】</w:t>
               <w:br/>
             </w:r>
             <w:r>
               <w:rPr>
                 <w:sz w:val="18"/>
               </w:rPr>
-              <w:t>13811458301</w:t>
+              <w:t>Menu:TranAnalysis</w:t>
               <w:br/>
               <w:br/>
             </w:r>
@@ -762,7 +2231,7 @@
               <w:rPr>
                 <w:sz w:val="16"/>
               </w:rPr>
-              <w:t>13811458301页面</w:t>
+              <w:t>Menu:Reports - Menu:TranAnalysis</w:t>
             </w:r>
           </w:p>
         </w:tc>
@@ -786,11 +2255,1490 @@
                     <a:graphicData uri="http://schemas.openxmlformats.org/drawingml/2006/picture">
                       <pic:pic>
                         <pic:nvPicPr>
-                          <pic:cNvPr id="0" name="0008_13811458301_13811458301.png"/>
+                          <pic:cNvPr id="0" name="0038_Menu_Reports_Menu_TranAnalysis.png"/>
                           <pic:cNvPicPr/>
                         </pic:nvPicPr>
                         <pic:blipFill>
                           <a:blip r:embed="rId16"/>
+                          <a:stretch>
+                            <a:fillRect/>
+                          </a:stretch>
+                        </pic:blipFill>
+                        <pic:spPr>
+                          <a:xfrm>
+                            <a:off x="0" y="0"/>
+                            <a:ext cx="3474720" cy="1702975"/>
+                          </a:xfrm>
+                          <a:prstGeom prst="rect"/>
+                        </pic:spPr>
+                      </pic:pic>
+                    </a:graphicData>
+                  </a:graphic>
+                </wp:inline>
+              </w:drawing>
+            </w:r>
+          </w:p>
+        </w:tc>
+      </w:tr>
+      <w:tr>
+        <w:tc>
+          <w:tcPr>
+            <w:tcW w:type="dxa" w:w="720"/>
+          </w:tcPr>
+          <w:p>
+            <w:pPr>
+              <w:jc w:val="center"/>
+            </w:pPr>
+            <w:r>
+              <w:t>39</w:t>
+            </w:r>
+          </w:p>
+        </w:tc>
+        <w:tc>
+          <w:tcPr>
+            <w:tcW w:type="dxa" w:w="3600"/>
+          </w:tcPr>
+          <w:p>
+            <w:r>
+              <w:rPr>
+                <w:b/>
+              </w:rPr>
+              <w:t>【Menu:Reports】</w:t>
+              <w:br/>
+            </w:r>
+            <w:r>
+              <w:rPr>
+                <w:sz w:val="18"/>
+              </w:rPr>
+              <w:t>Menu:TranReportItems</w:t>
+              <w:br/>
+              <w:br/>
+            </w:r>
+            <w:r>
+              <w:rPr>
+                <w:sz w:val="16"/>
+              </w:rPr>
+              <w:t>Menu:Reports - Menu:TranReportItems</w:t>
+            </w:r>
+          </w:p>
+        </w:tc>
+        <w:tc>
+          <w:tcPr>
+            <w:tcW w:type="dxa" w:w="5760"/>
+          </w:tcPr>
+          <w:p>
+            <w:pPr>
+              <w:jc w:val="center"/>
+            </w:pPr>
+            <w:r>
+              <w:drawing>
+                <wp:inline xmlns:a="http://schemas.openxmlformats.org/drawingml/2006/main" xmlns:pic="http://schemas.openxmlformats.org/drawingml/2006/picture">
+                  <wp:extent cx="3474720" cy="1702975"/>
+                  <wp:docPr id="9" name="Picture 9"/>
+                  <wp:cNvGraphicFramePr>
+                    <a:graphicFrameLocks noChangeAspect="1"/>
+                  </wp:cNvGraphicFramePr>
+                  <a:graphic>
+                    <a:graphicData uri="http://schemas.openxmlformats.org/drawingml/2006/picture">
+                      <pic:pic>
+                        <pic:nvPicPr>
+                          <pic:cNvPr id="0" name="0039_Menu_Reports_Menu_TranReportItems.png"/>
+                          <pic:cNvPicPr/>
+                        </pic:nvPicPr>
+                        <pic:blipFill>
+                          <a:blip r:embed="rId17"/>
+                          <a:stretch>
+                            <a:fillRect/>
+                          </a:stretch>
+                        </pic:blipFill>
+                        <pic:spPr>
+                          <a:xfrm>
+                            <a:off x="0" y="0"/>
+                            <a:ext cx="3474720" cy="1702975"/>
+                          </a:xfrm>
+                          <a:prstGeom prst="rect"/>
+                        </pic:spPr>
+                      </pic:pic>
+                    </a:graphicData>
+                  </a:graphic>
+                </wp:inline>
+              </w:drawing>
+            </w:r>
+          </w:p>
+        </w:tc>
+      </w:tr>
+      <w:tr>
+        <w:tc>
+          <w:tcPr>
+            <w:tcW w:type="dxa" w:w="720"/>
+          </w:tcPr>
+          <w:p>
+            <w:pPr>
+              <w:jc w:val="center"/>
+            </w:pPr>
+            <w:r>
+              <w:t>40</w:t>
+            </w:r>
+          </w:p>
+        </w:tc>
+        <w:tc>
+          <w:tcPr>
+            <w:tcW w:type="dxa" w:w="3600"/>
+          </w:tcPr>
+          <w:p>
+            <w:r>
+              <w:rPr>
+                <w:b/>
+              </w:rPr>
+              <w:t>【Menu:Reports】</w:t>
+              <w:br/>
+            </w:r>
+            <w:r>
+              <w:rPr>
+                <w:sz w:val="18"/>
+              </w:rPr>
+              <w:t>Menu:TranReportItems - 导入</w:t>
+              <w:br/>
+              <w:br/>
+            </w:r>
+            <w:r>
+              <w:rPr>
+                <w:sz w:val="16"/>
+              </w:rPr>
+              <w:t>导入功能</w:t>
+            </w:r>
+          </w:p>
+        </w:tc>
+        <w:tc>
+          <w:tcPr>
+            <w:tcW w:type="dxa" w:w="5760"/>
+          </w:tcPr>
+          <w:p>
+            <w:pPr>
+              <w:jc w:val="center"/>
+            </w:pPr>
+            <w:r>
+              <w:drawing>
+                <wp:inline xmlns:a="http://schemas.openxmlformats.org/drawingml/2006/main" xmlns:pic="http://schemas.openxmlformats.org/drawingml/2006/picture">
+                  <wp:extent cx="3474720" cy="1702975"/>
+                  <wp:docPr id="10" name="Picture 10"/>
+                  <wp:cNvGraphicFramePr>
+                    <a:graphicFrameLocks noChangeAspect="1"/>
+                  </wp:cNvGraphicFramePr>
+                  <a:graphic>
+                    <a:graphicData uri="http://schemas.openxmlformats.org/drawingml/2006/picture">
+                      <pic:pic>
+                        <pic:nvPicPr>
+                          <pic:cNvPr id="0" name="0040_Menu_Reports_Menu_TranReportItems - 导入.png"/>
+                          <pic:cNvPicPr/>
+                        </pic:nvPicPr>
+                        <pic:blipFill>
+                          <a:blip r:embed="rId18"/>
+                          <a:stretch>
+                            <a:fillRect/>
+                          </a:stretch>
+                        </pic:blipFill>
+                        <pic:spPr>
+                          <a:xfrm>
+                            <a:off x="0" y="0"/>
+                            <a:ext cx="3474720" cy="1702975"/>
+                          </a:xfrm>
+                          <a:prstGeom prst="rect"/>
+                        </pic:spPr>
+                      </pic:pic>
+                    </a:graphicData>
+                  </a:graphic>
+                </wp:inline>
+              </w:drawing>
+            </w:r>
+          </w:p>
+        </w:tc>
+      </w:tr>
+      <w:tr>
+        <w:tc>
+          <w:tcPr>
+            <w:tcW w:type="dxa" w:w="720"/>
+          </w:tcPr>
+          <w:p>
+            <w:pPr>
+              <w:jc w:val="center"/>
+            </w:pPr>
+            <w:r>
+              <w:t>41</w:t>
+            </w:r>
+          </w:p>
+        </w:tc>
+        <w:tc>
+          <w:tcPr>
+            <w:tcW w:type="dxa" w:w="3600"/>
+          </w:tcPr>
+          <w:p>
+            <w:r>
+              <w:rPr>
+                <w:b/>
+              </w:rPr>
+              <w:t>【Menu:Reports】</w:t>
+              <w:br/>
+            </w:r>
+            <w:r>
+              <w:rPr>
+                <w:sz w:val="18"/>
+              </w:rPr>
+              <w:t>Menu:TranReportItems - New Report Item</w:t>
+              <w:br/>
+              <w:br/>
+            </w:r>
+            <w:r>
+              <w:rPr>
+                <w:sz w:val="16"/>
+              </w:rPr>
+              <w:t>New Report Item功能</w:t>
+            </w:r>
+          </w:p>
+        </w:tc>
+        <w:tc>
+          <w:tcPr>
+            <w:tcW w:type="dxa" w:w="5760"/>
+          </w:tcPr>
+          <w:p>
+            <w:pPr>
+              <w:jc w:val="center"/>
+            </w:pPr>
+            <w:r>
+              <w:drawing>
+                <wp:inline xmlns:a="http://schemas.openxmlformats.org/drawingml/2006/main" xmlns:pic="http://schemas.openxmlformats.org/drawingml/2006/picture">
+                  <wp:extent cx="3474720" cy="1702975"/>
+                  <wp:docPr id="11" name="Picture 11"/>
+                  <wp:cNvGraphicFramePr>
+                    <a:graphicFrameLocks noChangeAspect="1"/>
+                  </wp:cNvGraphicFramePr>
+                  <a:graphic>
+                    <a:graphicData uri="http://schemas.openxmlformats.org/drawingml/2006/picture">
+                      <pic:pic>
+                        <pic:nvPicPr>
+                          <pic:cNvPr id="0" name="0041_Menu_Reports_Menu_TranReportItems - New Report Item.png"/>
+                          <pic:cNvPicPr/>
+                        </pic:nvPicPr>
+                        <pic:blipFill>
+                          <a:blip r:embed="rId19"/>
+                          <a:stretch>
+                            <a:fillRect/>
+                          </a:stretch>
+                        </pic:blipFill>
+                        <pic:spPr>
+                          <a:xfrm>
+                            <a:off x="0" y="0"/>
+                            <a:ext cx="3474720" cy="1702975"/>
+                          </a:xfrm>
+                          <a:prstGeom prst="rect"/>
+                        </pic:spPr>
+                      </pic:pic>
+                    </a:graphicData>
+                  </a:graphic>
+                </wp:inline>
+              </w:drawing>
+            </w:r>
+          </w:p>
+        </w:tc>
+      </w:tr>
+      <w:tr>
+        <w:tc>
+          <w:tcPr>
+            <w:tcW w:type="dxa" w:w="720"/>
+          </w:tcPr>
+          <w:p>
+            <w:pPr>
+              <w:jc w:val="center"/>
+            </w:pPr>
+            <w:r>
+              <w:t>42</w:t>
+            </w:r>
+          </w:p>
+        </w:tc>
+        <w:tc>
+          <w:tcPr>
+            <w:tcW w:type="dxa" w:w="3600"/>
+          </w:tcPr>
+          <w:p>
+            <w:r>
+              <w:rPr>
+                <w:b/>
+              </w:rPr>
+              <w:t>【Menu:Reports】</w:t>
+              <w:br/>
+            </w:r>
+            <w:r>
+              <w:rPr>
+                <w:sz w:val="18"/>
+              </w:rPr>
+              <w:t>Menu:LeaseWriteOffs</w:t>
+              <w:br/>
+              <w:br/>
+            </w:r>
+            <w:r>
+              <w:rPr>
+                <w:sz w:val="16"/>
+              </w:rPr>
+              <w:t>Menu:Reports - Menu:LeaseWriteOffs</w:t>
+            </w:r>
+          </w:p>
+        </w:tc>
+        <w:tc>
+          <w:tcPr>
+            <w:tcW w:type="dxa" w:w="5760"/>
+          </w:tcPr>
+          <w:p>
+            <w:pPr>
+              <w:jc w:val="center"/>
+            </w:pPr>
+            <w:r>
+              <w:drawing>
+                <wp:inline xmlns:a="http://schemas.openxmlformats.org/drawingml/2006/main" xmlns:pic="http://schemas.openxmlformats.org/drawingml/2006/picture">
+                  <wp:extent cx="3474720" cy="1702975"/>
+                  <wp:docPr id="12" name="Picture 12"/>
+                  <wp:cNvGraphicFramePr>
+                    <a:graphicFrameLocks noChangeAspect="1"/>
+                  </wp:cNvGraphicFramePr>
+                  <a:graphic>
+                    <a:graphicData uri="http://schemas.openxmlformats.org/drawingml/2006/picture">
+                      <pic:pic>
+                        <pic:nvPicPr>
+                          <pic:cNvPr id="0" name="0042_Menu_Reports_Menu_LeaseWriteOffs.png"/>
+                          <pic:cNvPicPr/>
+                        </pic:nvPicPr>
+                        <pic:blipFill>
+                          <a:blip r:embed="rId20"/>
+                          <a:stretch>
+                            <a:fillRect/>
+                          </a:stretch>
+                        </pic:blipFill>
+                        <pic:spPr>
+                          <a:xfrm>
+                            <a:off x="0" y="0"/>
+                            <a:ext cx="3474720" cy="1702975"/>
+                          </a:xfrm>
+                          <a:prstGeom prst="rect"/>
+                        </pic:spPr>
+                      </pic:pic>
+                    </a:graphicData>
+                  </a:graphic>
+                </wp:inline>
+              </w:drawing>
+            </w:r>
+          </w:p>
+        </w:tc>
+      </w:tr>
+      <w:tr>
+        <w:tc>
+          <w:tcPr>
+            <w:tcW w:type="dxa" w:w="720"/>
+          </w:tcPr>
+          <w:p>
+            <w:pPr>
+              <w:jc w:val="center"/>
+            </w:pPr>
+            <w:r>
+              <w:t>43</w:t>
+            </w:r>
+          </w:p>
+        </w:tc>
+        <w:tc>
+          <w:tcPr>
+            <w:tcW w:type="dxa" w:w="3600"/>
+          </w:tcPr>
+          <w:p>
+            <w:r>
+              <w:rPr>
+                <w:b/>
+              </w:rPr>
+              <w:t>【Menu:Reports】</w:t>
+              <w:br/>
+            </w:r>
+            <w:r>
+              <w:rPr>
+                <w:sz w:val="18"/>
+              </w:rPr>
+              <w:t>Menu:LeaseReport</w:t>
+              <w:br/>
+              <w:br/>
+            </w:r>
+            <w:r>
+              <w:rPr>
+                <w:sz w:val="16"/>
+              </w:rPr>
+              <w:t>Menu:Reports - Menu:LeaseReport</w:t>
+            </w:r>
+          </w:p>
+        </w:tc>
+        <w:tc>
+          <w:tcPr>
+            <w:tcW w:type="dxa" w:w="5760"/>
+          </w:tcPr>
+          <w:p>
+            <w:pPr>
+              <w:jc w:val="center"/>
+            </w:pPr>
+            <w:r>
+              <w:drawing>
+                <wp:inline xmlns:a="http://schemas.openxmlformats.org/drawingml/2006/main" xmlns:pic="http://schemas.openxmlformats.org/drawingml/2006/picture">
+                  <wp:extent cx="3474720" cy="1702975"/>
+                  <wp:docPr id="13" name="Picture 13"/>
+                  <wp:cNvGraphicFramePr>
+                    <a:graphicFrameLocks noChangeAspect="1"/>
+                  </wp:cNvGraphicFramePr>
+                  <a:graphic>
+                    <a:graphicData uri="http://schemas.openxmlformats.org/drawingml/2006/picture">
+                      <pic:pic>
+                        <pic:nvPicPr>
+                          <pic:cNvPr id="0" name="0043_Menu_Reports_Menu_LeaseReport.png"/>
+                          <pic:cNvPicPr/>
+                        </pic:nvPicPr>
+                        <pic:blipFill>
+                          <a:blip r:embed="rId21"/>
+                          <a:stretch>
+                            <a:fillRect/>
+                          </a:stretch>
+                        </pic:blipFill>
+                        <pic:spPr>
+                          <a:xfrm>
+                            <a:off x="0" y="0"/>
+                            <a:ext cx="3474720" cy="1702975"/>
+                          </a:xfrm>
+                          <a:prstGeom prst="rect"/>
+                        </pic:spPr>
+                      </pic:pic>
+                    </a:graphicData>
+                  </a:graphic>
+                </wp:inline>
+              </w:drawing>
+            </w:r>
+          </w:p>
+        </w:tc>
+      </w:tr>
+      <w:tr>
+        <w:tc>
+          <w:tcPr>
+            <w:tcW w:type="dxa" w:w="720"/>
+          </w:tcPr>
+          <w:p>
+            <w:pPr>
+              <w:jc w:val="center"/>
+            </w:pPr>
+            <w:r>
+              <w:t>44</w:t>
+            </w:r>
+          </w:p>
+        </w:tc>
+        <w:tc>
+          <w:tcPr>
+            <w:tcW w:type="dxa" w:w="3600"/>
+          </w:tcPr>
+          <w:p>
+            <w:r>
+              <w:rPr>
+                <w:b/>
+              </w:rPr>
+              <w:t>【Administration】</w:t>
+              <w:br/>
+            </w:r>
+            <w:r>
+              <w:rPr>
+                <w:sz w:val="18"/>
+              </w:rPr>
+              <w:t>File Management</w:t>
+              <w:br/>
+              <w:br/>
+            </w:r>
+            <w:r>
+              <w:rPr>
+                <w:sz w:val="16"/>
+              </w:rPr>
+              <w:t>Administration - File Management</w:t>
+            </w:r>
+          </w:p>
+        </w:tc>
+        <w:tc>
+          <w:tcPr>
+            <w:tcW w:type="dxa" w:w="5760"/>
+          </w:tcPr>
+          <w:p>
+            <w:pPr>
+              <w:jc w:val="center"/>
+            </w:pPr>
+            <w:r>
+              <w:drawing>
+                <wp:inline xmlns:a="http://schemas.openxmlformats.org/drawingml/2006/main" xmlns:pic="http://schemas.openxmlformats.org/drawingml/2006/picture">
+                  <wp:extent cx="3474720" cy="1702975"/>
+                  <wp:docPr id="14" name="Picture 14"/>
+                  <wp:cNvGraphicFramePr>
+                    <a:graphicFrameLocks noChangeAspect="1"/>
+                  </wp:cNvGraphicFramePr>
+                  <a:graphic>
+                    <a:graphicData uri="http://schemas.openxmlformats.org/drawingml/2006/picture">
+                      <pic:pic>
+                        <pic:nvPicPr>
+                          <pic:cNvPr id="0" name="0044_Administration_File Management.png"/>
+                          <pic:cNvPicPr/>
+                        </pic:nvPicPr>
+                        <pic:blipFill>
+                          <a:blip r:embed="rId22"/>
+                          <a:stretch>
+                            <a:fillRect/>
+                          </a:stretch>
+                        </pic:blipFill>
+                        <pic:spPr>
+                          <a:xfrm>
+                            <a:off x="0" y="0"/>
+                            <a:ext cx="3474720" cy="1702975"/>
+                          </a:xfrm>
+                          <a:prstGeom prst="rect"/>
+                        </pic:spPr>
+                      </pic:pic>
+                    </a:graphicData>
+                  </a:graphic>
+                </wp:inline>
+              </w:drawing>
+            </w:r>
+          </w:p>
+        </w:tc>
+      </w:tr>
+      <w:tr>
+        <w:tc>
+          <w:tcPr>
+            <w:tcW w:type="dxa" w:w="720"/>
+          </w:tcPr>
+          <w:p>
+            <w:pPr>
+              <w:jc w:val="center"/>
+            </w:pPr>
+            <w:r>
+              <w:t>45</w:t>
+            </w:r>
+          </w:p>
+        </w:tc>
+        <w:tc>
+          <w:tcPr>
+            <w:tcW w:type="dxa" w:w="3600"/>
+          </w:tcPr>
+          <w:p>
+            <w:r>
+              <w:rPr>
+                <w:b/>
+              </w:rPr>
+              <w:t>【Administration】</w:t>
+              <w:br/>
+            </w:r>
+            <w:r>
+              <w:rPr>
+                <w:sz w:val="18"/>
+              </w:rPr>
+              <w:t>File Management - Create Folder</w:t>
+              <w:br/>
+              <w:br/>
+            </w:r>
+            <w:r>
+              <w:rPr>
+                <w:sz w:val="16"/>
+              </w:rPr>
+              <w:t>Create Folder功能</w:t>
+            </w:r>
+          </w:p>
+        </w:tc>
+        <w:tc>
+          <w:tcPr>
+            <w:tcW w:type="dxa" w:w="5760"/>
+          </w:tcPr>
+          <w:p>
+            <w:pPr>
+              <w:jc w:val="center"/>
+            </w:pPr>
+            <w:r>
+              <w:drawing>
+                <wp:inline xmlns:a="http://schemas.openxmlformats.org/drawingml/2006/main" xmlns:pic="http://schemas.openxmlformats.org/drawingml/2006/picture">
+                  <wp:extent cx="3474720" cy="1702975"/>
+                  <wp:docPr id="15" name="Picture 15"/>
+                  <wp:cNvGraphicFramePr>
+                    <a:graphicFrameLocks noChangeAspect="1"/>
+                  </wp:cNvGraphicFramePr>
+                  <a:graphic>
+                    <a:graphicData uri="http://schemas.openxmlformats.org/drawingml/2006/picture">
+                      <pic:pic>
+                        <pic:nvPicPr>
+                          <pic:cNvPr id="0" name="0045_Administration_File Management - Create Folder.png"/>
+                          <pic:cNvPicPr/>
+                        </pic:nvPicPr>
+                        <pic:blipFill>
+                          <a:blip r:embed="rId23"/>
+                          <a:stretch>
+                            <a:fillRect/>
+                          </a:stretch>
+                        </pic:blipFill>
+                        <pic:spPr>
+                          <a:xfrm>
+                            <a:off x="0" y="0"/>
+                            <a:ext cx="3474720" cy="1702975"/>
+                          </a:xfrm>
+                          <a:prstGeom prst="rect"/>
+                        </pic:spPr>
+                      </pic:pic>
+                    </a:graphicData>
+                  </a:graphic>
+                </wp:inline>
+              </w:drawing>
+            </w:r>
+          </w:p>
+        </w:tc>
+      </w:tr>
+      <w:tr>
+        <w:tc>
+          <w:tcPr>
+            <w:tcW w:type="dxa" w:w="720"/>
+          </w:tcPr>
+          <w:p>
+            <w:pPr>
+              <w:jc w:val="center"/>
+            </w:pPr>
+            <w:r>
+              <w:t>46</w:t>
+            </w:r>
+          </w:p>
+        </w:tc>
+        <w:tc>
+          <w:tcPr>
+            <w:tcW w:type="dxa" w:w="3600"/>
+          </w:tcPr>
+          <w:p>
+            <w:r>
+              <w:rPr>
+                <w:b/>
+              </w:rPr>
+              <w:t>【Administration】</w:t>
+              <w:br/>
+            </w:r>
+            <w:r>
+              <w:rPr>
+                <w:sz w:val="18"/>
+              </w:rPr>
+              <w:t>Identity management</w:t>
+              <w:br/>
+              <w:br/>
+            </w:r>
+            <w:r>
+              <w:rPr>
+                <w:sz w:val="16"/>
+              </w:rPr>
+              <w:t>Administration - Identity management</w:t>
+            </w:r>
+          </w:p>
+        </w:tc>
+        <w:tc>
+          <w:tcPr>
+            <w:tcW w:type="dxa" w:w="5760"/>
+          </w:tcPr>
+          <w:p>
+            <w:pPr>
+              <w:jc w:val="center"/>
+            </w:pPr>
+            <w:r>
+              <w:drawing>
+                <wp:inline xmlns:a="http://schemas.openxmlformats.org/drawingml/2006/main" xmlns:pic="http://schemas.openxmlformats.org/drawingml/2006/picture">
+                  <wp:extent cx="3474720" cy="1702975"/>
+                  <wp:docPr id="16" name="Picture 16"/>
+                  <wp:cNvGraphicFramePr>
+                    <a:graphicFrameLocks noChangeAspect="1"/>
+                  </wp:cNvGraphicFramePr>
+                  <a:graphic>
+                    <a:graphicData uri="http://schemas.openxmlformats.org/drawingml/2006/picture">
+                      <pic:pic>
+                        <pic:nvPicPr>
+                          <pic:cNvPr id="0" name="0046_Administration_Identity management.png"/>
+                          <pic:cNvPicPr/>
+                        </pic:nvPicPr>
+                        <pic:blipFill>
+                          <a:blip r:embed="rId24"/>
+                          <a:stretch>
+                            <a:fillRect/>
+                          </a:stretch>
+                        </pic:blipFill>
+                        <pic:spPr>
+                          <a:xfrm>
+                            <a:off x="0" y="0"/>
+                            <a:ext cx="3474720" cy="1702975"/>
+                          </a:xfrm>
+                          <a:prstGeom prst="rect"/>
+                        </pic:spPr>
+                      </pic:pic>
+                    </a:graphicData>
+                  </a:graphic>
+                </wp:inline>
+              </w:drawing>
+            </w:r>
+          </w:p>
+        </w:tc>
+      </w:tr>
+      <w:tr>
+        <w:tc>
+          <w:tcPr>
+            <w:tcW w:type="dxa" w:w="720"/>
+          </w:tcPr>
+          <w:p>
+            <w:pPr>
+              <w:jc w:val="center"/>
+            </w:pPr>
+            <w:r>
+              <w:t>47</w:t>
+            </w:r>
+          </w:p>
+        </w:tc>
+        <w:tc>
+          <w:tcPr>
+            <w:tcW w:type="dxa" w:w="3600"/>
+          </w:tcPr>
+          <w:p>
+            <w:r>
+              <w:rPr>
+                <w:b/>
+              </w:rPr>
+              <w:t>【Administration】</w:t>
+              <w:br/>
+            </w:r>
+            <w:r>
+              <w:rPr>
+                <w:sz w:val="18"/>
+              </w:rPr>
+              <w:t>Text templates</w:t>
+              <w:br/>
+              <w:br/>
+            </w:r>
+            <w:r>
+              <w:rPr>
+                <w:sz w:val="16"/>
+              </w:rPr>
+              <w:t>Administration - Text templates</w:t>
+            </w:r>
+          </w:p>
+        </w:tc>
+        <w:tc>
+          <w:tcPr>
+            <w:tcW w:type="dxa" w:w="5760"/>
+          </w:tcPr>
+          <w:p>
+            <w:pPr>
+              <w:jc w:val="center"/>
+            </w:pPr>
+            <w:r>
+              <w:drawing>
+                <wp:inline xmlns:a="http://schemas.openxmlformats.org/drawingml/2006/main" xmlns:pic="http://schemas.openxmlformats.org/drawingml/2006/picture">
+                  <wp:extent cx="3474720" cy="1702975"/>
+                  <wp:docPr id="17" name="Picture 17"/>
+                  <wp:cNvGraphicFramePr>
+                    <a:graphicFrameLocks noChangeAspect="1"/>
+                  </wp:cNvGraphicFramePr>
+                  <a:graphic>
+                    <a:graphicData uri="http://schemas.openxmlformats.org/drawingml/2006/picture">
+                      <pic:pic>
+                        <pic:nvPicPr>
+                          <pic:cNvPr id="0" name="0047_Administration_Text templates.png"/>
+                          <pic:cNvPicPr/>
+                        </pic:nvPicPr>
+                        <pic:blipFill>
+                          <a:blip r:embed="rId25"/>
+                          <a:stretch>
+                            <a:fillRect/>
+                          </a:stretch>
+                        </pic:blipFill>
+                        <pic:spPr>
+                          <a:xfrm>
+                            <a:off x="0" y="0"/>
+                            <a:ext cx="3474720" cy="1702975"/>
+                          </a:xfrm>
+                          <a:prstGeom prst="rect"/>
+                        </pic:spPr>
+                      </pic:pic>
+                    </a:graphicData>
+                  </a:graphic>
+                </wp:inline>
+              </w:drawing>
+            </w:r>
+          </w:p>
+        </w:tc>
+      </w:tr>
+      <w:tr>
+        <w:tc>
+          <w:tcPr>
+            <w:tcW w:type="dxa" w:w="720"/>
+          </w:tcPr>
+          <w:p>
+            <w:pPr>
+              <w:jc w:val="center"/>
+            </w:pPr>
+            <w:r>
+              <w:t>48</w:t>
+            </w:r>
+          </w:p>
+        </w:tc>
+        <w:tc>
+          <w:tcPr>
+            <w:tcW w:type="dxa" w:w="3600"/>
+          </w:tcPr>
+          <w:p>
+            <w:r>
+              <w:rPr>
+                <w:b/>
+              </w:rPr>
+              <w:t>【Administration】</w:t>
+              <w:br/>
+            </w:r>
+            <w:r>
+              <w:rPr>
+                <w:sz w:val="18"/>
+              </w:rPr>
+              <w:t>Text templates - Edit contents</w:t>
+              <w:br/>
+              <w:br/>
+            </w:r>
+            <w:r>
+              <w:rPr>
+                <w:sz w:val="16"/>
+              </w:rPr>
+              <w:t>Edit contents功能</w:t>
+            </w:r>
+          </w:p>
+        </w:tc>
+        <w:tc>
+          <w:tcPr>
+            <w:tcW w:type="dxa" w:w="5760"/>
+          </w:tcPr>
+          <w:p>
+            <w:pPr>
+              <w:jc w:val="center"/>
+            </w:pPr>
+            <w:r>
+              <w:drawing>
+                <wp:inline xmlns:a="http://schemas.openxmlformats.org/drawingml/2006/main" xmlns:pic="http://schemas.openxmlformats.org/drawingml/2006/picture">
+                  <wp:extent cx="3474720" cy="1702975"/>
+                  <wp:docPr id="18" name="Picture 18"/>
+                  <wp:cNvGraphicFramePr>
+                    <a:graphicFrameLocks noChangeAspect="1"/>
+                  </wp:cNvGraphicFramePr>
+                  <a:graphic>
+                    <a:graphicData uri="http://schemas.openxmlformats.org/drawingml/2006/picture">
+                      <pic:pic>
+                        <pic:nvPicPr>
+                          <pic:cNvPr id="0" name="0048_Administration_Text templates - Edit contents.png"/>
+                          <pic:cNvPicPr/>
+                        </pic:nvPicPr>
+                        <pic:blipFill>
+                          <a:blip r:embed="rId26"/>
+                          <a:stretch>
+                            <a:fillRect/>
+                          </a:stretch>
+                        </pic:blipFill>
+                        <pic:spPr>
+                          <a:xfrm>
+                            <a:off x="0" y="0"/>
+                            <a:ext cx="3474720" cy="1702975"/>
+                          </a:xfrm>
+                          <a:prstGeom prst="rect"/>
+                        </pic:spPr>
+                      </pic:pic>
+                    </a:graphicData>
+                  </a:graphic>
+                </wp:inline>
+              </w:drawing>
+            </w:r>
+          </w:p>
+        </w:tc>
+      </w:tr>
+      <w:tr>
+        <w:tc>
+          <w:tcPr>
+            <w:tcW w:type="dxa" w:w="720"/>
+          </w:tcPr>
+          <w:p>
+            <w:pPr>
+              <w:jc w:val="center"/>
+            </w:pPr>
+            <w:r>
+              <w:t>49</w:t>
+            </w:r>
+          </w:p>
+        </w:tc>
+        <w:tc>
+          <w:tcPr>
+            <w:tcW w:type="dxa" w:w="3600"/>
+          </w:tcPr>
+          <w:p>
+            <w:r>
+              <w:rPr>
+                <w:b/>
+              </w:rPr>
+              <w:t>【Administration】</w:t>
+              <w:br/>
+            </w:r>
+            <w:r>
+              <w:rPr>
+                <w:sz w:val="18"/>
+              </w:rPr>
+              <w:t>Audit logs</w:t>
+              <w:br/>
+              <w:br/>
+            </w:r>
+            <w:r>
+              <w:rPr>
+                <w:sz w:val="16"/>
+              </w:rPr>
+              <w:t>Administration - Audit logs</w:t>
+            </w:r>
+          </w:p>
+        </w:tc>
+        <w:tc>
+          <w:tcPr>
+            <w:tcW w:type="dxa" w:w="5760"/>
+          </w:tcPr>
+          <w:p>
+            <w:pPr>
+              <w:jc w:val="center"/>
+            </w:pPr>
+            <w:r>
+              <w:drawing>
+                <wp:inline xmlns:a="http://schemas.openxmlformats.org/drawingml/2006/main" xmlns:pic="http://schemas.openxmlformats.org/drawingml/2006/picture">
+                  <wp:extent cx="3474720" cy="1702975"/>
+                  <wp:docPr id="19" name="Picture 19"/>
+                  <wp:cNvGraphicFramePr>
+                    <a:graphicFrameLocks noChangeAspect="1"/>
+                  </wp:cNvGraphicFramePr>
+                  <a:graphic>
+                    <a:graphicData uri="http://schemas.openxmlformats.org/drawingml/2006/picture">
+                      <pic:pic>
+                        <pic:nvPicPr>
+                          <pic:cNvPr id="0" name="0049_Administration_Audit logs.png"/>
+                          <pic:cNvPicPr/>
+                        </pic:nvPicPr>
+                        <pic:blipFill>
+                          <a:blip r:embed="rId27"/>
+                          <a:stretch>
+                            <a:fillRect/>
+                          </a:stretch>
+                        </pic:blipFill>
+                        <pic:spPr>
+                          <a:xfrm>
+                            <a:off x="0" y="0"/>
+                            <a:ext cx="3474720" cy="1702975"/>
+                          </a:xfrm>
+                          <a:prstGeom prst="rect"/>
+                        </pic:spPr>
+                      </pic:pic>
+                    </a:graphicData>
+                  </a:graphic>
+                </wp:inline>
+              </w:drawing>
+            </w:r>
+          </w:p>
+        </w:tc>
+      </w:tr>
+      <w:tr>
+        <w:tc>
+          <w:tcPr>
+            <w:tcW w:type="dxa" w:w="720"/>
+          </w:tcPr>
+          <w:p>
+            <w:pPr>
+              <w:jc w:val="center"/>
+            </w:pPr>
+            <w:r>
+              <w:t>50</w:t>
+            </w:r>
+          </w:p>
+        </w:tc>
+        <w:tc>
+          <w:tcPr>
+            <w:tcW w:type="dxa" w:w="3600"/>
+          </w:tcPr>
+          <w:p>
+            <w:r>
+              <w:rPr>
+                <w:b/>
+              </w:rPr>
+              <w:t>【Administration】</w:t>
+              <w:br/>
+            </w:r>
+            <w:r>
+              <w:rPr>
+                <w:sz w:val="18"/>
+              </w:rPr>
+              <w:t>Settings</w:t>
+              <w:br/>
+              <w:br/>
+            </w:r>
+            <w:r>
+              <w:rPr>
+                <w:sz w:val="16"/>
+              </w:rPr>
+              <w:t>Administration - Settings</w:t>
+            </w:r>
+          </w:p>
+        </w:tc>
+        <w:tc>
+          <w:tcPr>
+            <w:tcW w:type="dxa" w:w="5760"/>
+          </w:tcPr>
+          <w:p>
+            <w:pPr>
+              <w:jc w:val="center"/>
+            </w:pPr>
+            <w:r>
+              <w:drawing>
+                <wp:inline xmlns:a="http://schemas.openxmlformats.org/drawingml/2006/main" xmlns:pic="http://schemas.openxmlformats.org/drawingml/2006/picture">
+                  <wp:extent cx="3474720" cy="1702975"/>
+                  <wp:docPr id="20" name="Picture 20"/>
+                  <wp:cNvGraphicFramePr>
+                    <a:graphicFrameLocks noChangeAspect="1"/>
+                  </wp:cNvGraphicFramePr>
+                  <a:graphic>
+                    <a:graphicData uri="http://schemas.openxmlformats.org/drawingml/2006/picture">
+                      <pic:pic>
+                        <pic:nvPicPr>
+                          <pic:cNvPr id="0" name="0050_Administration_Settings.png"/>
+                          <pic:cNvPicPr/>
+                        </pic:nvPicPr>
+                        <pic:blipFill>
+                          <a:blip r:embed="rId28"/>
+                          <a:stretch>
+                            <a:fillRect/>
+                          </a:stretch>
+                        </pic:blipFill>
+                        <pic:spPr>
+                          <a:xfrm>
+                            <a:off x="0" y="0"/>
+                            <a:ext cx="3474720" cy="1702975"/>
+                          </a:xfrm>
+                          <a:prstGeom prst="rect"/>
+                        </pic:spPr>
+                      </pic:pic>
+                    </a:graphicData>
+                  </a:graphic>
+                </wp:inline>
+              </w:drawing>
+            </w:r>
+          </w:p>
+        </w:tc>
+      </w:tr>
+      <w:tr>
+        <w:tc>
+          <w:tcPr>
+            <w:tcW w:type="dxa" w:w="720"/>
+          </w:tcPr>
+          <w:p>
+            <w:pPr>
+              <w:jc w:val="center"/>
+            </w:pPr>
+            <w:r>
+              <w:t>51</w:t>
+            </w:r>
+          </w:p>
+        </w:tc>
+        <w:tc>
+          <w:tcPr>
+            <w:tcW w:type="dxa" w:w="3600"/>
+          </w:tcPr>
+          <w:p>
+            <w:r>
+              <w:rPr>
+                <w:b/>
+              </w:rPr>
+              <w:t>【Administration】</w:t>
+              <w:br/>
+            </w:r>
+            <w:r>
+              <w:rPr>
+                <w:sz w:val="18"/>
+              </w:rPr>
+              <w:t>Holiday Groups</w:t>
+              <w:br/>
+              <w:br/>
+            </w:r>
+            <w:r>
+              <w:rPr>
+                <w:sz w:val="16"/>
+              </w:rPr>
+              <w:t>Administration - Holiday Groups</w:t>
+            </w:r>
+          </w:p>
+        </w:tc>
+        <w:tc>
+          <w:tcPr>
+            <w:tcW w:type="dxa" w:w="5760"/>
+          </w:tcPr>
+          <w:p>
+            <w:pPr>
+              <w:jc w:val="center"/>
+            </w:pPr>
+            <w:r>
+              <w:drawing>
+                <wp:inline xmlns:a="http://schemas.openxmlformats.org/drawingml/2006/main" xmlns:pic="http://schemas.openxmlformats.org/drawingml/2006/picture">
+                  <wp:extent cx="3474720" cy="1702975"/>
+                  <wp:docPr id="21" name="Picture 21"/>
+                  <wp:cNvGraphicFramePr>
+                    <a:graphicFrameLocks noChangeAspect="1"/>
+                  </wp:cNvGraphicFramePr>
+                  <a:graphic>
+                    <a:graphicData uri="http://schemas.openxmlformats.org/drawingml/2006/picture">
+                      <pic:pic>
+                        <pic:nvPicPr>
+                          <pic:cNvPr id="0" name="0051_Administration_Holiday Groups.png"/>
+                          <pic:cNvPicPr/>
+                        </pic:nvPicPr>
+                        <pic:blipFill>
+                          <a:blip r:embed="rId29"/>
+                          <a:stretch>
+                            <a:fillRect/>
+                          </a:stretch>
+                        </pic:blipFill>
+                        <pic:spPr>
+                          <a:xfrm>
+                            <a:off x="0" y="0"/>
+                            <a:ext cx="3474720" cy="1702975"/>
+                          </a:xfrm>
+                          <a:prstGeom prst="rect"/>
+                        </pic:spPr>
+                      </pic:pic>
+                    </a:graphicData>
+                  </a:graphic>
+                </wp:inline>
+              </w:drawing>
+            </w:r>
+          </w:p>
+        </w:tc>
+      </w:tr>
+      <w:tr>
+        <w:tc>
+          <w:tcPr>
+            <w:tcW w:type="dxa" w:w="720"/>
+          </w:tcPr>
+          <w:p>
+            <w:pPr>
+              <w:jc w:val="center"/>
+            </w:pPr>
+            <w:r>
+              <w:t>52</w:t>
+            </w:r>
+          </w:p>
+        </w:tc>
+        <w:tc>
+          <w:tcPr>
+            <w:tcW w:type="dxa" w:w="3600"/>
+          </w:tcPr>
+          <w:p>
+            <w:r>
+              <w:rPr>
+                <w:b/>
+              </w:rPr>
+              <w:t>【Administration】</w:t>
+              <w:br/>
+            </w:r>
+            <w:r>
+              <w:rPr>
+                <w:sz w:val="18"/>
+              </w:rPr>
+              <w:t>Holiday Groups - New Holiday Group</w:t>
+              <w:br/>
+              <w:br/>
+            </w:r>
+            <w:r>
+              <w:rPr>
+                <w:sz w:val="16"/>
+              </w:rPr>
+              <w:t>New Holiday Group功能</w:t>
+            </w:r>
+          </w:p>
+        </w:tc>
+        <w:tc>
+          <w:tcPr>
+            <w:tcW w:type="dxa" w:w="5760"/>
+          </w:tcPr>
+          <w:p>
+            <w:pPr>
+              <w:jc w:val="center"/>
+            </w:pPr>
+            <w:r>
+              <w:drawing>
+                <wp:inline xmlns:a="http://schemas.openxmlformats.org/drawingml/2006/main" xmlns:pic="http://schemas.openxmlformats.org/drawingml/2006/picture">
+                  <wp:extent cx="3474720" cy="1702975"/>
+                  <wp:docPr id="22" name="Picture 22"/>
+                  <wp:cNvGraphicFramePr>
+                    <a:graphicFrameLocks noChangeAspect="1"/>
+                  </wp:cNvGraphicFramePr>
+                  <a:graphic>
+                    <a:graphicData uri="http://schemas.openxmlformats.org/drawingml/2006/picture">
+                      <pic:pic>
+                        <pic:nvPicPr>
+                          <pic:cNvPr id="0" name="0052_Administration_Holiday Groups - New Holiday Group.png"/>
+                          <pic:cNvPicPr/>
+                        </pic:nvPicPr>
+                        <pic:blipFill>
+                          <a:blip r:embed="rId30"/>
+                          <a:stretch>
+                            <a:fillRect/>
+                          </a:stretch>
+                        </pic:blipFill>
+                        <pic:spPr>
+                          <a:xfrm>
+                            <a:off x="0" y="0"/>
+                            <a:ext cx="3474720" cy="1702975"/>
+                          </a:xfrm>
+                          <a:prstGeom prst="rect"/>
+                        </pic:spPr>
+                      </pic:pic>
+                    </a:graphicData>
+                  </a:graphic>
+                </wp:inline>
+              </w:drawing>
+            </w:r>
+          </w:p>
+        </w:tc>
+      </w:tr>
+      <w:tr>
+        <w:tc>
+          <w:tcPr>
+            <w:tcW w:type="dxa" w:w="720"/>
+          </w:tcPr>
+          <w:p>
+            <w:pPr>
+              <w:jc w:val="center"/>
+            </w:pPr>
+            <w:r>
+              <w:t>53</w:t>
+            </w:r>
+          </w:p>
+        </w:tc>
+        <w:tc>
+          <w:tcPr>
+            <w:tcW w:type="dxa" w:w="3600"/>
+          </w:tcPr>
+          <w:p>
+            <w:r>
+              <w:rPr>
+                <w:b/>
+              </w:rPr>
+              <w:t>【Administration】</w:t>
+              <w:br/>
+            </w:r>
+            <w:r>
+              <w:rPr>
+                <w:sz w:val="18"/>
+              </w:rPr>
+              <w:t>Holiday Groups - 添加节假日日期</w:t>
+              <w:br/>
+              <w:br/>
+            </w:r>
+            <w:r>
+              <w:rPr>
+                <w:sz w:val="16"/>
+              </w:rPr>
+              <w:t>添加节假日日期功能</w:t>
+            </w:r>
+          </w:p>
+        </w:tc>
+        <w:tc>
+          <w:tcPr>
+            <w:tcW w:type="dxa" w:w="5760"/>
+          </w:tcPr>
+          <w:p>
+            <w:pPr>
+              <w:jc w:val="center"/>
+            </w:pPr>
+            <w:r>
+              <w:drawing>
+                <wp:inline xmlns:a="http://schemas.openxmlformats.org/drawingml/2006/main" xmlns:pic="http://schemas.openxmlformats.org/drawingml/2006/picture">
+                  <wp:extent cx="3474720" cy="1702975"/>
+                  <wp:docPr id="23" name="Picture 23"/>
+                  <wp:cNvGraphicFramePr>
+                    <a:graphicFrameLocks noChangeAspect="1"/>
+                  </wp:cNvGraphicFramePr>
+                  <a:graphic>
+                    <a:graphicData uri="http://schemas.openxmlformats.org/drawingml/2006/picture">
+                      <pic:pic>
+                        <pic:nvPicPr>
+                          <pic:cNvPr id="0" name="0053_Administration_Holiday Groups - 添加节假日日期.png"/>
+                          <pic:cNvPicPr/>
+                        </pic:nvPicPr>
+                        <pic:blipFill>
+                          <a:blip r:embed="rId31"/>
+                          <a:stretch>
+                            <a:fillRect/>
+                          </a:stretch>
+                        </pic:blipFill>
+                        <pic:spPr>
+                          <a:xfrm>
+                            <a:off x="0" y="0"/>
+                            <a:ext cx="3474720" cy="1702975"/>
+                          </a:xfrm>
+                          <a:prstGeom prst="rect"/>
+                        </pic:spPr>
+                      </pic:pic>
+                    </a:graphicData>
+                  </a:graphic>
+                </wp:inline>
+              </w:drawing>
+            </w:r>
+          </w:p>
+        </w:tc>
+      </w:tr>
+      <w:tr>
+        <w:tc>
+          <w:tcPr>
+            <w:tcW w:type="dxa" w:w="720"/>
+          </w:tcPr>
+          <w:p>
+            <w:pPr>
+              <w:jc w:val="center"/>
+            </w:pPr>
+            <w:r>
+              <w:t>54</w:t>
+            </w:r>
+          </w:p>
+        </w:tc>
+        <w:tc>
+          <w:tcPr>
+            <w:tcW w:type="dxa" w:w="3600"/>
+          </w:tcPr>
+          <w:p>
+            <w:r>
+              <w:rPr>
+                <w:b/>
+              </w:rPr>
+              <w:t>【Administration】</w:t>
+              <w:br/>
+            </w:r>
+            <w:r>
+              <w:rPr>
+                <w:sz w:val="18"/>
+              </w:rPr>
+              <w:t>Store</w:t>
+              <w:br/>
+              <w:br/>
+            </w:r>
+            <w:r>
+              <w:rPr>
+                <w:sz w:val="16"/>
+              </w:rPr>
+              <w:t>Administration - Store</w:t>
+            </w:r>
+          </w:p>
+        </w:tc>
+        <w:tc>
+          <w:tcPr>
+            <w:tcW w:type="dxa" w:w="5760"/>
+          </w:tcPr>
+          <w:p>
+            <w:pPr>
+              <w:jc w:val="center"/>
+            </w:pPr>
+            <w:r>
+              <w:drawing>
+                <wp:inline xmlns:a="http://schemas.openxmlformats.org/drawingml/2006/main" xmlns:pic="http://schemas.openxmlformats.org/drawingml/2006/picture">
+                  <wp:extent cx="3474720" cy="1702975"/>
+                  <wp:docPr id="24" name="Picture 24"/>
+                  <wp:cNvGraphicFramePr>
+                    <a:graphicFrameLocks noChangeAspect="1"/>
+                  </wp:cNvGraphicFramePr>
+                  <a:graphic>
+                    <a:graphicData uri="http://schemas.openxmlformats.org/drawingml/2006/picture">
+                      <pic:pic>
+                        <pic:nvPicPr>
+                          <pic:cNvPr id="0" name="0054_Administration_Store.png"/>
+                          <pic:cNvPicPr/>
+                        </pic:nvPicPr>
+                        <pic:blipFill>
+                          <a:blip r:embed="rId32"/>
+                          <a:stretch>
+                            <a:fillRect/>
+                          </a:stretch>
+                        </pic:blipFill>
+                        <pic:spPr>
+                          <a:xfrm>
+                            <a:off x="0" y="0"/>
+                            <a:ext cx="3474720" cy="1702975"/>
+                          </a:xfrm>
+                          <a:prstGeom prst="rect"/>
+                        </pic:spPr>
+                      </pic:pic>
+                    </a:graphicData>
+                  </a:graphic>
+                </wp:inline>
+              </w:drawing>
+            </w:r>
+          </w:p>
+        </w:tc>
+      </w:tr>
+      <w:tr>
+        <w:tc>
+          <w:tcPr>
+            <w:tcW w:type="dxa" w:w="720"/>
+          </w:tcPr>
+          <w:p>
+            <w:pPr>
+              <w:jc w:val="center"/>
+            </w:pPr>
+            <w:r>
+              <w:t>55</w:t>
+            </w:r>
+          </w:p>
+        </w:tc>
+        <w:tc>
+          <w:tcPr>
+            <w:tcW w:type="dxa" w:w="3600"/>
+          </w:tcPr>
+          <w:p>
+            <w:r>
+              <w:rPr>
+                <w:b/>
+              </w:rPr>
+              <w:t>【13811458301】</w:t>
+              <w:br/>
+            </w:r>
+            <w:r>
+              <w:rPr>
+                <w:sz w:val="18"/>
+              </w:rPr>
+              <w:t>13811458301页面</w:t>
+              <w:br/>
+              <w:br/>
+            </w:r>
+            <w:r>
+              <w:rPr>
+                <w:sz w:val="16"/>
+              </w:rPr>
+              <w:t>13811458301功能模块</w:t>
+            </w:r>
+          </w:p>
+        </w:tc>
+        <w:tc>
+          <w:tcPr>
+            <w:tcW w:type="dxa" w:w="5760"/>
+          </w:tcPr>
+          <w:p>
+            <w:pPr>
+              <w:jc w:val="center"/>
+            </w:pPr>
+            <w:r>
+              <w:drawing>
+                <wp:inline xmlns:a="http://schemas.openxmlformats.org/drawingml/2006/main" xmlns:pic="http://schemas.openxmlformats.org/drawingml/2006/picture">
+                  <wp:extent cx="3474720" cy="1702975"/>
+                  <wp:docPr id="25" name="Picture 25"/>
+                  <wp:cNvGraphicFramePr>
+                    <a:graphicFrameLocks noChangeAspect="1"/>
+                  </wp:cNvGraphicFramePr>
+                  <a:graphic>
+                    <a:graphicData uri="http://schemas.openxmlformats.org/drawingml/2006/picture">
+                      <pic:pic>
+                        <pic:nvPicPr>
+                          <pic:cNvPr id="0" name="0055_13811458301_13811458301页面.png"/>
+                          <pic:cNvPicPr/>
+                        </pic:nvPicPr>
+                        <pic:blipFill>
+                          <a:blip r:embed="rId33"/>
                           <a:stretch>
                             <a:fillRect/>
                           </a:stretch>

</xml_diff>